<commit_message>
Reverse 1 Lab Grand progress
</commit_message>
<xml_diff>
--- a/Five/R/Lab1/МихайличТРИПО_Лаб1.docx
+++ b/Five/R/Lab1/МихайличТРИПО_Лаб1.docx
@@ -828,36 +828,2349 @@
     </w:p>
     <w:p>
       <w:pPr>
+        <w:pStyle w:val="a9"/>
+      </w:pPr>
+      <w:r>
+        <w:br w:type="page"/>
+      </w:r>
+      <w:r>
+        <w:lastRenderedPageBreak/>
+        <w:t>Цель работы</w:t>
+      </w:r>
+    </w:p>
+    <w:p>
+      <w:pPr>
+        <w:rPr>
+          <w:rFonts w:cs="Times New Roman"/>
+        </w:rPr>
+      </w:pPr>
+      <w:r>
+        <w:rPr>
+          <w:rFonts w:cs="Times New Roman"/>
+        </w:rPr>
+        <w:t>Изучение методов защиты программного обеспечения и возможных способов их преодоления.</w:t>
+      </w:r>
+    </w:p>
+    <w:p/>
+    <w:p>
+      <w:pPr>
+        <w:pStyle w:val="a9"/>
+      </w:pPr>
+      <w:r>
+        <w:t>ход работы</w:t>
+      </w:r>
+    </w:p>
+    <w:p>
+      <w:r>
+        <w:t xml:space="preserve">В начале защищаемого проекта было добавлено обновление, которое в начале точки входа программы считывает пароль из файла </w:t>
+      </w:r>
+      <w:r>
+        <w:rPr>
+          <w:lang w:val="en-US"/>
+        </w:rPr>
+        <w:t>password</w:t>
+      </w:r>
+      <w:r>
+        <w:t>.</w:t>
+      </w:r>
+      <w:r>
+        <w:rPr>
+          <w:lang w:val="en-US"/>
+        </w:rPr>
+        <w:t>txt</w:t>
+      </w:r>
+      <w:r>
+        <w:t xml:space="preserve"> </w:t>
+      </w:r>
+      <w:r>
+        <w:t>и сравнивает его с правильным.</w:t>
+      </w:r>
+      <w:r>
+        <w:t xml:space="preserve"> Если в файле </w:t>
+      </w:r>
+      <w:r>
+        <w:rPr>
+          <w:lang w:val="en-US"/>
+        </w:rPr>
+        <w:t>password</w:t>
+      </w:r>
+      <w:r>
+        <w:t>.</w:t>
+      </w:r>
+      <w:r>
+        <w:rPr>
+          <w:lang w:val="en-US"/>
+        </w:rPr>
+        <w:t>txt</w:t>
+      </w:r>
+      <w:r>
+        <w:t xml:space="preserve"> </w:t>
+      </w:r>
+      <w:r>
+        <w:t>находится верный пароль, то проект начинает работу.</w:t>
+      </w:r>
+    </w:p>
+    <w:p/>
+    <w:p>
+      <w:pPr>
+        <w:pStyle w:val="a8"/>
+      </w:pPr>
+      <w:r>
+        <w:rPr>
+          <w:noProof/>
+          <w:lang w:val="en-US"/>
+        </w:rPr>
+        <w:drawing>
+          <wp:inline distT="0" distB="0" distL="0" distR="0" wp14:anchorId="38872E4A" wp14:editId="3507A0F4">
+            <wp:extent cx="5229955" cy="5553850"/>
+            <wp:effectExtent l="0" t="0" r="8890" b="8890"/>
+            <wp:docPr id="1410135879" name="Picture 1"/>
+            <wp:cNvGraphicFramePr>
+              <a:graphicFrameLocks xmlns:a="http://schemas.openxmlformats.org/drawingml/2006/main" noChangeAspect="1"/>
+            </wp:cNvGraphicFramePr>
+            <a:graphic xmlns:a="http://schemas.openxmlformats.org/drawingml/2006/main">
+              <a:graphicData uri="http://schemas.openxmlformats.org/drawingml/2006/picture">
+                <pic:pic xmlns:pic="http://schemas.openxmlformats.org/drawingml/2006/picture">
+                  <pic:nvPicPr>
+                    <pic:cNvPr id="1410135879" name=""/>
+                    <pic:cNvPicPr/>
+                  </pic:nvPicPr>
+                  <pic:blipFill>
+                    <a:blip r:embed="rId8"/>
+                    <a:stretch>
+                      <a:fillRect/>
+                    </a:stretch>
+                  </pic:blipFill>
+                  <pic:spPr>
+                    <a:xfrm>
+                      <a:off x="0" y="0"/>
+                      <a:ext cx="5229955" cy="5553850"/>
+                    </a:xfrm>
+                    <a:prstGeom prst="rect">
+                      <a:avLst/>
+                    </a:prstGeom>
+                  </pic:spPr>
+                </pic:pic>
+              </a:graphicData>
+            </a:graphic>
+          </wp:inline>
+        </w:drawing>
+      </w:r>
+    </w:p>
+    <w:p>
+      <w:pPr>
+        <w:pStyle w:val="a"/>
+      </w:pPr>
+      <w:r>
+        <w:t>Точка входа проекта с проверкой пароля</w:t>
+      </w:r>
+    </w:p>
+    <w:p/>
+    <w:p>
+      <w:pPr>
+        <w:pStyle w:val="a8"/>
+        <w:rPr>
+          <w:lang w:val="en-US"/>
+        </w:rPr>
+      </w:pPr>
+      <w:r>
+        <w:rPr>
+          <w:noProof/>
+          <w:lang w:val="en-US"/>
+        </w:rPr>
+        <w:lastRenderedPageBreak/>
+        <w:drawing>
+          <wp:inline distT="0" distB="0" distL="0" distR="0" wp14:anchorId="6B692130" wp14:editId="3B2B220D">
+            <wp:extent cx="4982270" cy="4143953"/>
+            <wp:effectExtent l="0" t="0" r="8890" b="9525"/>
+            <wp:docPr id="83880859" name="Picture 1"/>
+            <wp:cNvGraphicFramePr>
+              <a:graphicFrameLocks xmlns:a="http://schemas.openxmlformats.org/drawingml/2006/main" noChangeAspect="1"/>
+            </wp:cNvGraphicFramePr>
+            <a:graphic xmlns:a="http://schemas.openxmlformats.org/drawingml/2006/main">
+              <a:graphicData uri="http://schemas.openxmlformats.org/drawingml/2006/picture">
+                <pic:pic xmlns:pic="http://schemas.openxmlformats.org/drawingml/2006/picture">
+                  <pic:nvPicPr>
+                    <pic:cNvPr id="83880859" name=""/>
+                    <pic:cNvPicPr/>
+                  </pic:nvPicPr>
+                  <pic:blipFill>
+                    <a:blip r:embed="rId9"/>
+                    <a:stretch>
+                      <a:fillRect/>
+                    </a:stretch>
+                  </pic:blipFill>
+                  <pic:spPr>
+                    <a:xfrm>
+                      <a:off x="0" y="0"/>
+                      <a:ext cx="4982270" cy="4143953"/>
+                    </a:xfrm>
+                    <a:prstGeom prst="rect">
+                      <a:avLst/>
+                    </a:prstGeom>
+                  </pic:spPr>
+                </pic:pic>
+              </a:graphicData>
+            </a:graphic>
+          </wp:inline>
+        </w:drawing>
+      </w:r>
+    </w:p>
+    <w:p>
+      <w:pPr>
+        <w:pStyle w:val="a"/>
+      </w:pPr>
+      <w:r>
+        <w:t>Обработка неверного пароля</w:t>
+      </w:r>
+    </w:p>
+    <w:p/>
+    <w:p>
+      <w:r>
+        <w:t xml:space="preserve">Для обхода данной проверки пароля был проведен бинарный патчинг, в котором команда </w:t>
+      </w:r>
+      <w:proofErr w:type="spellStart"/>
+      <w:r>
+        <w:rPr>
+          <w:lang w:val="en-US"/>
+        </w:rPr>
+        <w:t>jz</w:t>
+      </w:r>
+      <w:proofErr w:type="spellEnd"/>
+      <w:r>
+        <w:t xml:space="preserve"> </w:t>
+      </w:r>
+      <w:r>
+        <w:t xml:space="preserve">заменена на </w:t>
+      </w:r>
+      <w:proofErr w:type="spellStart"/>
+      <w:r>
+        <w:rPr>
+          <w:lang w:val="en-US"/>
+        </w:rPr>
+        <w:t>jnz</w:t>
+      </w:r>
+      <w:proofErr w:type="spellEnd"/>
+      <w:r>
+        <w:t>.</w:t>
+      </w:r>
+    </w:p>
+    <w:p/>
+    <w:p>
+      <w:pPr>
+        <w:pStyle w:val="a8"/>
+        <w:rPr>
+          <w:lang w:val="en-US"/>
+        </w:rPr>
+      </w:pPr>
+      <w:r>
+        <w:rPr>
+          <w:noProof/>
+          <w:lang w:val="en-US"/>
+        </w:rPr>
+        <w:lastRenderedPageBreak/>
+        <w:drawing>
+          <wp:inline distT="0" distB="0" distL="0" distR="0" wp14:anchorId="5F9AB254" wp14:editId="5D62C574">
+            <wp:extent cx="6300470" cy="3606165"/>
+            <wp:effectExtent l="0" t="0" r="0" b="0"/>
+            <wp:docPr id="1997647967" name="Picture 1"/>
+            <wp:cNvGraphicFramePr>
+              <a:graphicFrameLocks xmlns:a="http://schemas.openxmlformats.org/drawingml/2006/main" noChangeAspect="1"/>
+            </wp:cNvGraphicFramePr>
+            <a:graphic xmlns:a="http://schemas.openxmlformats.org/drawingml/2006/main">
+              <a:graphicData uri="http://schemas.openxmlformats.org/drawingml/2006/picture">
+                <pic:pic xmlns:pic="http://schemas.openxmlformats.org/drawingml/2006/picture">
+                  <pic:nvPicPr>
+                    <pic:cNvPr id="1997647967" name=""/>
+                    <pic:cNvPicPr/>
+                  </pic:nvPicPr>
+                  <pic:blipFill>
+                    <a:blip r:embed="rId10"/>
+                    <a:stretch>
+                      <a:fillRect/>
+                    </a:stretch>
+                  </pic:blipFill>
+                  <pic:spPr>
+                    <a:xfrm>
+                      <a:off x="0" y="0"/>
+                      <a:ext cx="6300470" cy="3606165"/>
+                    </a:xfrm>
+                    <a:prstGeom prst="rect">
+                      <a:avLst/>
+                    </a:prstGeom>
+                  </pic:spPr>
+                </pic:pic>
+              </a:graphicData>
+            </a:graphic>
+          </wp:inline>
+        </w:drawing>
+      </w:r>
+    </w:p>
+    <w:p>
+      <w:pPr>
+        <w:pStyle w:val="a"/>
+      </w:pPr>
+      <w:r>
+        <w:t>Бинарный патчинг программы</w:t>
+      </w:r>
+    </w:p>
+    <w:p>
+      <w:r>
+        <w:t>Теперь при вводе неправильного пароля проект сообщает, что пароль верный и запускается основная часть.</w:t>
+      </w:r>
+    </w:p>
+    <w:p>
+      <w:pPr>
         <w:spacing w:line="240" w:lineRule="auto"/>
         <w:ind w:firstLine="0"/>
         <w:rPr>
           <w:rFonts w:eastAsia="Times New Roman" w:cs="Times New Roman"/>
         </w:rPr>
       </w:pPr>
-      <w:r>
-        <w:rPr>
-          <w:rFonts w:eastAsia="Times New Roman" w:cs="Times New Roman"/>
-        </w:rPr>
+    </w:p>
+    <w:p>
+      <w:pPr>
+        <w:pStyle w:val="a8"/>
+        <w:rPr>
+          <w:rFonts w:eastAsia="Times New Roman"/>
+        </w:rPr>
+      </w:pPr>
+      <w:r>
+        <w:rPr>
+          <w:rFonts w:eastAsia="Times New Roman"/>
+          <w:noProof/>
+        </w:rPr>
+        <w:drawing>
+          <wp:inline distT="0" distB="0" distL="0" distR="0" wp14:anchorId="0B99401E" wp14:editId="113D63FE">
+            <wp:extent cx="4353533" cy="2781688"/>
+            <wp:effectExtent l="0" t="0" r="9525" b="0"/>
+            <wp:docPr id="1639296445" name="Picture 1"/>
+            <wp:cNvGraphicFramePr>
+              <a:graphicFrameLocks xmlns:a="http://schemas.openxmlformats.org/drawingml/2006/main" noChangeAspect="1"/>
+            </wp:cNvGraphicFramePr>
+            <a:graphic xmlns:a="http://schemas.openxmlformats.org/drawingml/2006/main">
+              <a:graphicData uri="http://schemas.openxmlformats.org/drawingml/2006/picture">
+                <pic:pic xmlns:pic="http://schemas.openxmlformats.org/drawingml/2006/picture">
+                  <pic:nvPicPr>
+                    <pic:cNvPr id="1639296445" name=""/>
+                    <pic:cNvPicPr/>
+                  </pic:nvPicPr>
+                  <pic:blipFill>
+                    <a:blip r:embed="rId11"/>
+                    <a:stretch>
+                      <a:fillRect/>
+                    </a:stretch>
+                  </pic:blipFill>
+                  <pic:spPr>
+                    <a:xfrm>
+                      <a:off x="0" y="0"/>
+                      <a:ext cx="4353533" cy="2781688"/>
+                    </a:xfrm>
+                    <a:prstGeom prst="rect">
+                      <a:avLst/>
+                    </a:prstGeom>
+                  </pic:spPr>
+                </pic:pic>
+              </a:graphicData>
+            </a:graphic>
+          </wp:inline>
+        </w:drawing>
+      </w:r>
+    </w:p>
+    <w:p>
+      <w:pPr>
+        <w:pStyle w:val="a"/>
+      </w:pPr>
+      <w:r>
+        <w:t>Результат патчинга</w:t>
+      </w:r>
+    </w:p>
+    <w:p/>
+    <w:p>
+      <w:r>
+        <w:t xml:space="preserve">В качестве мер защиты </w:t>
+      </w:r>
+      <w:r>
+        <w:t xml:space="preserve">используемые </w:t>
+      </w:r>
+      <w:r>
+        <w:t>в проверке строки были посимвольно зашифрованы</w:t>
+      </w:r>
+      <w:r>
+        <w:t xml:space="preserve"> </w:t>
+      </w:r>
+      <w:r>
+        <w:t xml:space="preserve">с использованием </w:t>
+      </w:r>
+      <w:proofErr w:type="spellStart"/>
+      <w:r>
+        <w:rPr>
+          <w:lang w:val="en-US"/>
+        </w:rPr>
+        <w:t>xor</w:t>
+      </w:r>
+      <w:proofErr w:type="spellEnd"/>
+      <w:r>
+        <w:t xml:space="preserve"> с использованием ключа, который был определен через </w:t>
+      </w:r>
+      <w:r>
+        <w:rPr>
+          <w:lang w:val="en-US"/>
+        </w:rPr>
+        <w:t>define</w:t>
+      </w:r>
+      <w:r>
+        <w:t xml:space="preserve">, </w:t>
+      </w:r>
+      <w:r>
+        <w:t xml:space="preserve">и переведены в </w:t>
+      </w:r>
+      <w:r>
+        <w:rPr>
+          <w:lang w:val="en-US"/>
+        </w:rPr>
+        <w:t>hex</w:t>
+      </w:r>
+      <w:r>
+        <w:t xml:space="preserve"> </w:t>
+      </w:r>
+      <w:r>
+        <w:t xml:space="preserve">формат. Также был </w:t>
+      </w:r>
+      <w:r>
         <w:lastRenderedPageBreak/>
-        <w:br w:type="page"/>
-      </w:r>
-    </w:p>
-    <w:p>
-      <w:pPr>
-        <w:spacing w:line="240" w:lineRule="auto"/>
+        <w:t>создан внешний буфер, который виден во всем проекте</w:t>
+      </w:r>
+      <w:r>
+        <w:t xml:space="preserve">, в который во время работы будет хранить расшифрованные строки, использовать их и очищаться. Для реализации данных мер защиты в проект был добавлен файл </w:t>
+      </w:r>
+      <w:r>
+        <w:rPr>
+          <w:lang w:val="en-US"/>
+        </w:rPr>
+        <w:t>crypt</w:t>
+      </w:r>
+      <w:r>
+        <w:t>.</w:t>
+      </w:r>
+      <w:r>
+        <w:rPr>
+          <w:lang w:val="en-US"/>
+        </w:rPr>
+        <w:t>c</w:t>
+      </w:r>
+      <w:r>
+        <w:t xml:space="preserve"> </w:t>
+      </w:r>
+      <w:r>
+        <w:t xml:space="preserve">с заголовочным файлом, чтобы основной файл </w:t>
+      </w:r>
+      <w:r>
+        <w:rPr>
+          <w:lang w:val="en-US"/>
+        </w:rPr>
+        <w:t>main</w:t>
+      </w:r>
+      <w:r>
+        <w:t>.</w:t>
+      </w:r>
+      <w:r>
+        <w:rPr>
+          <w:lang w:val="en-US"/>
+        </w:rPr>
+        <w:t>c</w:t>
+      </w:r>
+      <w:r>
+        <w:t xml:space="preserve"> </w:t>
+      </w:r>
+      <w:r>
+        <w:t>мог использовать его функции и внешние переменные.</w:t>
+      </w:r>
+    </w:p>
+    <w:p/>
+    <w:p>
+      <w:pPr>
+        <w:pStyle w:val="a8"/>
+        <w:rPr>
+          <w:lang w:val="en-US"/>
+        </w:rPr>
+      </w:pPr>
+      <w:r>
+        <w:rPr>
+          <w:noProof/>
+        </w:rPr>
+        <w:drawing>
+          <wp:inline distT="0" distB="0" distL="0" distR="0" wp14:anchorId="7981ACAD" wp14:editId="03572436">
+            <wp:extent cx="6300470" cy="3990340"/>
+            <wp:effectExtent l="0" t="0" r="0" b="0"/>
+            <wp:docPr id="165419143" name="Picture 1"/>
+            <wp:cNvGraphicFramePr>
+              <a:graphicFrameLocks xmlns:a="http://schemas.openxmlformats.org/drawingml/2006/main" noChangeAspect="1"/>
+            </wp:cNvGraphicFramePr>
+            <a:graphic xmlns:a="http://schemas.openxmlformats.org/drawingml/2006/main">
+              <a:graphicData uri="http://schemas.openxmlformats.org/drawingml/2006/picture">
+                <pic:pic xmlns:pic="http://schemas.openxmlformats.org/drawingml/2006/picture">
+                  <pic:nvPicPr>
+                    <pic:cNvPr id="165419143" name=""/>
+                    <pic:cNvPicPr/>
+                  </pic:nvPicPr>
+                  <pic:blipFill>
+                    <a:blip r:embed="rId12"/>
+                    <a:stretch>
+                      <a:fillRect/>
+                    </a:stretch>
+                  </pic:blipFill>
+                  <pic:spPr>
+                    <a:xfrm>
+                      <a:off x="0" y="0"/>
+                      <a:ext cx="6300470" cy="3990340"/>
+                    </a:xfrm>
+                    <a:prstGeom prst="rect">
+                      <a:avLst/>
+                    </a:prstGeom>
+                  </pic:spPr>
+                </pic:pic>
+              </a:graphicData>
+            </a:graphic>
+          </wp:inline>
+        </w:drawing>
+      </w:r>
+    </w:p>
+    <w:p>
+      <w:pPr>
+        <w:pStyle w:val="a"/>
+      </w:pPr>
+      <w:r>
+        <w:t>Зашифрованные строки и их расшифровка в буфер</w:t>
+      </w:r>
+    </w:p>
+    <w:p/>
+    <w:p>
+      <w:r>
+        <w:t>Данный пример шифрования является симметричным, когда процесс шифрования не отличается от процесса дешифрования. Также для уменьшения места обнаружения незашифрованной строки в буфере, сам буфер сразу же очищается.</w:t>
+      </w:r>
+    </w:p>
+    <w:p/>
+    <w:p/>
+    <w:p>
+      <w:pPr>
+        <w:pStyle w:val="a8"/>
+      </w:pPr>
+      <w:r>
+        <w:rPr>
+          <w:noProof/>
+        </w:rPr>
+        <w:lastRenderedPageBreak/>
+        <w:drawing>
+          <wp:inline distT="0" distB="0" distL="0" distR="0" wp14:anchorId="154B4190" wp14:editId="031EE666">
+            <wp:extent cx="4058216" cy="2429214"/>
+            <wp:effectExtent l="0" t="0" r="0" b="9525"/>
+            <wp:docPr id="1103074052" name="Picture 1"/>
+            <wp:cNvGraphicFramePr>
+              <a:graphicFrameLocks xmlns:a="http://schemas.openxmlformats.org/drawingml/2006/main" noChangeAspect="1"/>
+            </wp:cNvGraphicFramePr>
+            <a:graphic xmlns:a="http://schemas.openxmlformats.org/drawingml/2006/main">
+              <a:graphicData uri="http://schemas.openxmlformats.org/drawingml/2006/picture">
+                <pic:pic xmlns:pic="http://schemas.openxmlformats.org/drawingml/2006/picture">
+                  <pic:nvPicPr>
+                    <pic:cNvPr id="1103074052" name=""/>
+                    <pic:cNvPicPr/>
+                  </pic:nvPicPr>
+                  <pic:blipFill>
+                    <a:blip r:embed="rId13"/>
+                    <a:stretch>
+                      <a:fillRect/>
+                    </a:stretch>
+                  </pic:blipFill>
+                  <pic:spPr>
+                    <a:xfrm>
+                      <a:off x="0" y="0"/>
+                      <a:ext cx="4058216" cy="2429214"/>
+                    </a:xfrm>
+                    <a:prstGeom prst="rect">
+                      <a:avLst/>
+                    </a:prstGeom>
+                  </pic:spPr>
+                </pic:pic>
+              </a:graphicData>
+            </a:graphic>
+          </wp:inline>
+        </w:drawing>
+      </w:r>
+    </w:p>
+    <w:p>
+      <w:pPr>
+        <w:pStyle w:val="a"/>
+      </w:pPr>
+      <w:r>
+        <w:t xml:space="preserve">Шифрование входной строки по ключу, используя </w:t>
+      </w:r>
+      <w:proofErr w:type="spellStart"/>
+      <w:r>
+        <w:rPr>
+          <w:lang w:val="en-US"/>
+        </w:rPr>
+        <w:t>xor</w:t>
+      </w:r>
+      <w:proofErr w:type="spellEnd"/>
+    </w:p>
+    <w:p/>
+    <w:p>
+      <w:r>
+        <w:t xml:space="preserve">Но возникает другая проблема, при открытии файла в дизасемблере в функции </w:t>
+      </w:r>
+      <w:r>
+        <w:rPr>
+          <w:lang w:val="en-US"/>
+        </w:rPr>
+        <w:t>encrypt</w:t>
+      </w:r>
+      <w:r>
+        <w:t xml:space="preserve"> </w:t>
+      </w:r>
+      <w:r>
+        <w:t>можно обнаружить ключ в незашифрованном виде.</w:t>
+      </w:r>
+      <w:r>
+        <w:t xml:space="preserve"> Если прочитать ассемблерные инструкции можно заметить, что исходный ключ помещается в </w:t>
+      </w:r>
+      <w:proofErr w:type="spellStart"/>
+      <w:r>
+        <w:rPr>
+          <w:lang w:val="en-US"/>
+        </w:rPr>
+        <w:t>rdx</w:t>
+      </w:r>
+      <w:proofErr w:type="spellEnd"/>
+      <w:r>
+        <w:t xml:space="preserve">, а в </w:t>
+      </w:r>
+      <w:proofErr w:type="spellStart"/>
+      <w:r>
+        <w:rPr>
+          <w:lang w:val="en-US"/>
+        </w:rPr>
+        <w:t>eax</w:t>
+      </w:r>
+      <w:proofErr w:type="spellEnd"/>
+      <w:r>
+        <w:t xml:space="preserve"> </w:t>
+      </w:r>
+      <w:r>
+        <w:t xml:space="preserve">будет записан байт из </w:t>
+      </w:r>
+      <w:proofErr w:type="spellStart"/>
+      <w:r>
+        <w:rPr>
+          <w:lang w:val="en-US"/>
+        </w:rPr>
+        <w:t>rdx</w:t>
+      </w:r>
+      <w:proofErr w:type="spellEnd"/>
+      <w:r>
+        <w:t xml:space="preserve">, учитывая смещение, то есть исходя из кода можно полагать что байты из </w:t>
+      </w:r>
+      <w:proofErr w:type="spellStart"/>
+      <w:r>
+        <w:rPr>
+          <w:lang w:val="en-US"/>
+        </w:rPr>
+        <w:t>rdx</w:t>
+      </w:r>
+      <w:proofErr w:type="spellEnd"/>
+      <w:r>
+        <w:t xml:space="preserve"> </w:t>
+      </w:r>
+      <w:r>
+        <w:t xml:space="preserve">берутся посимвольно, а затем идет </w:t>
+      </w:r>
+      <w:proofErr w:type="spellStart"/>
+      <w:r>
+        <w:rPr>
+          <w:lang w:val="en-US"/>
+        </w:rPr>
+        <w:t>xor</w:t>
+      </w:r>
+      <w:proofErr w:type="spellEnd"/>
+      <w:r>
+        <w:t xml:space="preserve"> </w:t>
+      </w:r>
+      <w:proofErr w:type="spellStart"/>
+      <w:r>
+        <w:rPr>
+          <w:lang w:val="en-US"/>
+        </w:rPr>
+        <w:t>ecx</w:t>
+      </w:r>
+      <w:proofErr w:type="spellEnd"/>
+      <w:r>
+        <w:t xml:space="preserve">, </w:t>
+      </w:r>
+      <w:proofErr w:type="spellStart"/>
+      <w:r>
+        <w:rPr>
+          <w:lang w:val="en-US"/>
+        </w:rPr>
+        <w:t>eax</w:t>
+      </w:r>
+      <w:proofErr w:type="spellEnd"/>
+      <w:r>
+        <w:t xml:space="preserve">, </w:t>
+      </w:r>
+      <w:r>
+        <w:t xml:space="preserve">а в </w:t>
+      </w:r>
+      <w:proofErr w:type="spellStart"/>
+      <w:r>
+        <w:rPr>
+          <w:lang w:val="en-US"/>
+        </w:rPr>
+        <w:t>ecx</w:t>
+      </w:r>
+      <w:proofErr w:type="spellEnd"/>
+      <w:r>
+        <w:t xml:space="preserve"> </w:t>
+      </w:r>
+      <w:r>
+        <w:t>хранится байт входящей строки</w:t>
+      </w:r>
+      <w:r>
+        <w:t xml:space="preserve">. Из этого можно сделать вывод, что в </w:t>
+      </w:r>
+      <w:proofErr w:type="spellStart"/>
+      <w:r>
+        <w:rPr>
+          <w:lang w:val="en-US"/>
+        </w:rPr>
+        <w:t>eax</w:t>
+      </w:r>
+      <w:proofErr w:type="spellEnd"/>
+      <w:r>
+        <w:t xml:space="preserve"> </w:t>
+      </w:r>
+      <w:r>
+        <w:t xml:space="preserve">будет записан резултат </w:t>
+      </w:r>
+      <w:proofErr w:type="spellStart"/>
+      <w:r>
+        <w:rPr>
+          <w:lang w:val="en-US"/>
+        </w:rPr>
+        <w:t>xor</w:t>
+      </w:r>
+      <w:proofErr w:type="spellEnd"/>
+      <w:r>
+        <w:t xml:space="preserve"> </w:t>
+      </w:r>
+      <w:r>
+        <w:t>шифрования входящей строки и ключа.</w:t>
+      </w:r>
+    </w:p>
+    <w:p>
+      <w:pPr>
+        <w:pStyle w:val="a8"/>
+      </w:pPr>
+      <w:r>
+        <w:rPr>
+          <w:noProof/>
+        </w:rPr>
+        <w:lastRenderedPageBreak/>
+        <w:drawing>
+          <wp:inline distT="0" distB="0" distL="0" distR="0" wp14:anchorId="5054D755" wp14:editId="2E76CA63">
+            <wp:extent cx="6300470" cy="3734435"/>
+            <wp:effectExtent l="0" t="0" r="0" b="0"/>
+            <wp:docPr id="1098612094" name="Picture 1"/>
+            <wp:cNvGraphicFramePr>
+              <a:graphicFrameLocks xmlns:a="http://schemas.openxmlformats.org/drawingml/2006/main" noChangeAspect="1"/>
+            </wp:cNvGraphicFramePr>
+            <a:graphic xmlns:a="http://schemas.openxmlformats.org/drawingml/2006/main">
+              <a:graphicData uri="http://schemas.openxmlformats.org/drawingml/2006/picture">
+                <pic:pic xmlns:pic="http://schemas.openxmlformats.org/drawingml/2006/picture">
+                  <pic:nvPicPr>
+                    <pic:cNvPr id="1098612094" name=""/>
+                    <pic:cNvPicPr/>
+                  </pic:nvPicPr>
+                  <pic:blipFill>
+                    <a:blip r:embed="rId14"/>
+                    <a:stretch>
+                      <a:fillRect/>
+                    </a:stretch>
+                  </pic:blipFill>
+                  <pic:spPr>
+                    <a:xfrm>
+                      <a:off x="0" y="0"/>
+                      <a:ext cx="6300470" cy="3734435"/>
+                    </a:xfrm>
+                    <a:prstGeom prst="rect">
+                      <a:avLst/>
+                    </a:prstGeom>
+                  </pic:spPr>
+                </pic:pic>
+              </a:graphicData>
+            </a:graphic>
+          </wp:inline>
+        </w:drawing>
+      </w:r>
+    </w:p>
+    <w:p>
+      <w:pPr>
+        <w:pStyle w:val="a"/>
+      </w:pPr>
+      <w:r>
+        <w:t xml:space="preserve">Незашифрованный ключ в </w:t>
+      </w:r>
+      <w:r>
+        <w:rPr>
+          <w:lang w:val="en-US"/>
+        </w:rPr>
+        <w:t>encrypt</w:t>
+      </w:r>
+    </w:p>
+    <w:p/>
+    <w:p>
+      <w:r>
+        <w:t>Для решения данной проблемы в ключ была добавленная крипрографическая соль, которая вставляется в ключ в каждый индекс, который является простым числом. Также была модифицированна функция шифрования, которая расшифровывает строку только по составным индексам ключа. Также было проверено, совпадают ли зашифрованные строки ключом с солью, и без.</w:t>
+      </w:r>
+      <w:r>
+        <w:t xml:space="preserve"> Добавление соли в ключ можно считать методом противодействия дизасемблированию так как не позволяет увидеть ключ в открытом виде в дизасемблере и усложняет анализ процесса шифрования.</w:t>
+      </w:r>
+    </w:p>
+    <w:p/>
+    <w:p>
+      <w:pPr>
+        <w:pStyle w:val="a8"/>
+      </w:pPr>
+      <w:r>
+        <w:rPr>
+          <w:noProof/>
+        </w:rPr>
+        <w:lastRenderedPageBreak/>
+        <w:drawing>
+          <wp:inline distT="0" distB="0" distL="0" distR="0" wp14:anchorId="4B846531" wp14:editId="4C70C2DE">
+            <wp:extent cx="6300470" cy="2736850"/>
+            <wp:effectExtent l="0" t="0" r="0" b="0"/>
+            <wp:docPr id="1248460995" name="Picture 1"/>
+            <wp:cNvGraphicFramePr>
+              <a:graphicFrameLocks xmlns:a="http://schemas.openxmlformats.org/drawingml/2006/main" noChangeAspect="1"/>
+            </wp:cNvGraphicFramePr>
+            <a:graphic xmlns:a="http://schemas.openxmlformats.org/drawingml/2006/main">
+              <a:graphicData uri="http://schemas.openxmlformats.org/drawingml/2006/picture">
+                <pic:pic xmlns:pic="http://schemas.openxmlformats.org/drawingml/2006/picture">
+                  <pic:nvPicPr>
+                    <pic:cNvPr id="1248460995" name=""/>
+                    <pic:cNvPicPr/>
+                  </pic:nvPicPr>
+                  <pic:blipFill>
+                    <a:blip r:embed="rId15"/>
+                    <a:stretch>
+                      <a:fillRect/>
+                    </a:stretch>
+                  </pic:blipFill>
+                  <pic:spPr>
+                    <a:xfrm>
+                      <a:off x="0" y="0"/>
+                      <a:ext cx="6300470" cy="2736850"/>
+                    </a:xfrm>
+                    <a:prstGeom prst="rect">
+                      <a:avLst/>
+                    </a:prstGeom>
+                  </pic:spPr>
+                </pic:pic>
+              </a:graphicData>
+            </a:graphic>
+          </wp:inline>
+        </w:drawing>
+      </w:r>
+    </w:p>
+    <w:p>
+      <w:pPr>
+        <w:pStyle w:val="a"/>
+      </w:pPr>
+      <w:r>
+        <w:t>Сравнение зашифрованных строк ключом с солью и без.</w:t>
+      </w:r>
+    </w:p>
+    <w:p/>
+    <w:p>
+      <w:pPr>
+        <w:pStyle w:val="a8"/>
+      </w:pPr>
+      <w:r>
+        <w:rPr>
+          <w:noProof/>
+        </w:rPr>
+        <w:drawing>
+          <wp:inline distT="0" distB="0" distL="0" distR="0" wp14:anchorId="0A005685" wp14:editId="0A8A3465">
+            <wp:extent cx="6300470" cy="2606675"/>
+            <wp:effectExtent l="0" t="0" r="0" b="0"/>
+            <wp:docPr id="109117972" name="Picture 1"/>
+            <wp:cNvGraphicFramePr>
+              <a:graphicFrameLocks xmlns:a="http://schemas.openxmlformats.org/drawingml/2006/main" noChangeAspect="1"/>
+            </wp:cNvGraphicFramePr>
+            <a:graphic xmlns:a="http://schemas.openxmlformats.org/drawingml/2006/main">
+              <a:graphicData uri="http://schemas.openxmlformats.org/drawingml/2006/picture">
+                <pic:pic xmlns:pic="http://schemas.openxmlformats.org/drawingml/2006/picture">
+                  <pic:nvPicPr>
+                    <pic:cNvPr id="109117972" name=""/>
+                    <pic:cNvPicPr/>
+                  </pic:nvPicPr>
+                  <pic:blipFill>
+                    <a:blip r:embed="rId16"/>
+                    <a:stretch>
+                      <a:fillRect/>
+                    </a:stretch>
+                  </pic:blipFill>
+                  <pic:spPr>
+                    <a:xfrm>
+                      <a:off x="0" y="0"/>
+                      <a:ext cx="6300470" cy="2606675"/>
+                    </a:xfrm>
+                    <a:prstGeom prst="rect">
+                      <a:avLst/>
+                    </a:prstGeom>
+                  </pic:spPr>
+                </pic:pic>
+              </a:graphicData>
+            </a:graphic>
+          </wp:inline>
+        </w:drawing>
+      </w:r>
+    </w:p>
+    <w:p>
+      <w:pPr>
+        <w:pStyle w:val="a"/>
+      </w:pPr>
+      <w:r>
+        <w:t>Проверка правильности расшифровки строк ключом с солью.</w:t>
+      </w:r>
+    </w:p>
+    <w:p/>
+    <w:p>
+      <w:r>
+        <w:t xml:space="preserve">В качестве дополнительной меры защиты было реализовано вычисление и проверка </w:t>
+      </w:r>
+      <w:r>
+        <w:rPr>
+          <w:lang w:val="en-US"/>
+        </w:rPr>
+        <w:t>CRC</w:t>
+      </w:r>
+      <w:r>
+        <w:t>(</w:t>
+      </w:r>
+      <w:r>
+        <w:rPr>
+          <w:lang w:val="en-US"/>
+        </w:rPr>
+        <w:t>cyclic</w:t>
+      </w:r>
+      <w:r>
+        <w:t xml:space="preserve"> </w:t>
+      </w:r>
+      <w:r>
+        <w:rPr>
+          <w:lang w:val="en-US"/>
+        </w:rPr>
+        <w:t>redundancy</w:t>
+      </w:r>
+      <w:r>
+        <w:t xml:space="preserve"> </w:t>
+      </w:r>
+      <w:r>
+        <w:rPr>
+          <w:lang w:val="en-US"/>
+        </w:rPr>
+        <w:t>check</w:t>
+      </w:r>
+      <w:r>
+        <w:t xml:space="preserve">) </w:t>
+      </w:r>
+      <w:r>
+        <w:t>–</w:t>
+      </w:r>
+      <w:r>
+        <w:t xml:space="preserve"> </w:t>
+      </w:r>
+      <w:r>
+        <w:t>алгоритм вычилсения контрольной суммы для проверки целостности всего кода проекта.</w:t>
+      </w:r>
+      <w:r>
+        <w:t xml:space="preserve"> </w:t>
+      </w:r>
+      <w:r>
+        <w:t xml:space="preserve">Посчет </w:t>
+      </w:r>
+      <w:r>
+        <w:rPr>
+          <w:lang w:val="en-US"/>
+        </w:rPr>
+        <w:t>CRC</w:t>
+      </w:r>
+      <w:r>
+        <w:t xml:space="preserve"> </w:t>
+      </w:r>
+      <w:r>
+        <w:t xml:space="preserve">предотвращает попытки изменения файла через дизассемблер. </w:t>
+      </w:r>
+      <w:r>
+        <w:rPr>
+          <w:lang w:val="en-US"/>
+        </w:rPr>
+        <w:t>CRC</w:t>
+      </w:r>
+      <w:r>
+        <w:t xml:space="preserve"> </w:t>
+      </w:r>
+      <w:r>
+        <w:t xml:space="preserve">измененного файла будет отличаться от эталонной, которая была вычислена и записана в файл </w:t>
+      </w:r>
+      <w:r>
+        <w:rPr>
+          <w:lang w:val="en-US"/>
+        </w:rPr>
+        <w:t>checksum</w:t>
+      </w:r>
+      <w:r>
+        <w:t>.</w:t>
+      </w:r>
+      <w:r>
+        <w:rPr>
+          <w:lang w:val="en-US"/>
+        </w:rPr>
+        <w:t>txt</w:t>
+      </w:r>
+      <w:r>
+        <w:t>.</w:t>
+      </w:r>
+    </w:p>
+    <w:p/>
+    <w:p>
+      <w:pPr>
+        <w:pStyle w:val="a8"/>
+      </w:pPr>
+      <w:r>
+        <w:rPr>
+          <w:noProof/>
+        </w:rPr>
+        <w:lastRenderedPageBreak/>
+        <w:drawing>
+          <wp:inline distT="0" distB="0" distL="0" distR="0" wp14:anchorId="30D99D85" wp14:editId="277CC552">
+            <wp:extent cx="6134956" cy="4763165"/>
+            <wp:effectExtent l="0" t="0" r="0" b="0"/>
+            <wp:docPr id="216537632" name="Picture 1"/>
+            <wp:cNvGraphicFramePr>
+              <a:graphicFrameLocks xmlns:a="http://schemas.openxmlformats.org/drawingml/2006/main" noChangeAspect="1"/>
+            </wp:cNvGraphicFramePr>
+            <a:graphic xmlns:a="http://schemas.openxmlformats.org/drawingml/2006/main">
+              <a:graphicData uri="http://schemas.openxmlformats.org/drawingml/2006/picture">
+                <pic:pic xmlns:pic="http://schemas.openxmlformats.org/drawingml/2006/picture">
+                  <pic:nvPicPr>
+                    <pic:cNvPr id="216537632" name=""/>
+                    <pic:cNvPicPr/>
+                  </pic:nvPicPr>
+                  <pic:blipFill>
+                    <a:blip r:embed="rId17"/>
+                    <a:stretch>
+                      <a:fillRect/>
+                    </a:stretch>
+                  </pic:blipFill>
+                  <pic:spPr>
+                    <a:xfrm>
+                      <a:off x="0" y="0"/>
+                      <a:ext cx="6134956" cy="4763165"/>
+                    </a:xfrm>
+                    <a:prstGeom prst="rect">
+                      <a:avLst/>
+                    </a:prstGeom>
+                  </pic:spPr>
+                </pic:pic>
+              </a:graphicData>
+            </a:graphic>
+          </wp:inline>
+        </w:drawing>
+      </w:r>
+    </w:p>
+    <w:p>
+      <w:pPr>
+        <w:pStyle w:val="a"/>
+      </w:pPr>
+      <w:r>
+        <w:t xml:space="preserve">Посчет </w:t>
+      </w:r>
+      <w:r>
+        <w:rPr>
+          <w:lang w:val="en-US"/>
+        </w:rPr>
+        <w:t>CRC</w:t>
+      </w:r>
+      <w:r>
+        <w:t xml:space="preserve"> </w:t>
+      </w:r>
+      <w:r>
+        <w:t xml:space="preserve">всего </w:t>
+      </w:r>
+      <w:r>
+        <w:t>.</w:t>
+      </w:r>
+      <w:r>
+        <w:rPr>
+          <w:lang w:val="en-US"/>
+        </w:rPr>
+        <w:t>exe</w:t>
+      </w:r>
+      <w:r>
+        <w:t xml:space="preserve"> </w:t>
+      </w:r>
+      <w:r>
+        <w:t>файла</w:t>
+      </w:r>
+    </w:p>
+    <w:p/>
+    <w:p>
+      <w:pPr>
+        <w:pStyle w:val="a8"/>
+      </w:pPr>
+      <w:r>
+        <w:rPr>
+          <w:noProof/>
+        </w:rPr>
+        <w:lastRenderedPageBreak/>
+        <w:drawing>
+          <wp:inline distT="0" distB="0" distL="0" distR="0" wp14:anchorId="40662FD3" wp14:editId="2B4597DB">
+            <wp:extent cx="5982535" cy="4134427"/>
+            <wp:effectExtent l="0" t="0" r="0" b="0"/>
+            <wp:docPr id="1255863248" name="Picture 1"/>
+            <wp:cNvGraphicFramePr>
+              <a:graphicFrameLocks xmlns:a="http://schemas.openxmlformats.org/drawingml/2006/main" noChangeAspect="1"/>
+            </wp:cNvGraphicFramePr>
+            <a:graphic xmlns:a="http://schemas.openxmlformats.org/drawingml/2006/main">
+              <a:graphicData uri="http://schemas.openxmlformats.org/drawingml/2006/picture">
+                <pic:pic xmlns:pic="http://schemas.openxmlformats.org/drawingml/2006/picture">
+                  <pic:nvPicPr>
+                    <pic:cNvPr id="1255863248" name=""/>
+                    <pic:cNvPicPr/>
+                  </pic:nvPicPr>
+                  <pic:blipFill>
+                    <a:blip r:embed="rId18"/>
+                    <a:stretch>
+                      <a:fillRect/>
+                    </a:stretch>
+                  </pic:blipFill>
+                  <pic:spPr>
+                    <a:xfrm>
+                      <a:off x="0" y="0"/>
+                      <a:ext cx="5982535" cy="4134427"/>
+                    </a:xfrm>
+                    <a:prstGeom prst="rect">
+                      <a:avLst/>
+                    </a:prstGeom>
+                  </pic:spPr>
+                </pic:pic>
+              </a:graphicData>
+            </a:graphic>
+          </wp:inline>
+        </w:drawing>
+      </w:r>
+    </w:p>
+    <w:p>
+      <w:pPr>
+        <w:pStyle w:val="a"/>
+      </w:pPr>
+      <w:r>
+        <w:t xml:space="preserve">Проверка </w:t>
+      </w:r>
+      <w:r>
+        <w:rPr>
+          <w:lang w:val="en-US"/>
+        </w:rPr>
+        <w:t xml:space="preserve">CRC </w:t>
+      </w:r>
+      <w:r>
+        <w:t>текущего файла.</w:t>
+      </w:r>
+    </w:p>
+    <w:p/>
+    <w:p>
+      <w:pPr>
+        <w:pStyle w:val="a8"/>
+      </w:pPr>
+      <w:r>
+        <w:rPr>
+          <w:noProof/>
+        </w:rPr>
+        <w:drawing>
+          <wp:inline distT="0" distB="0" distL="0" distR="0" wp14:anchorId="27A590E0" wp14:editId="36816622">
+            <wp:extent cx="6300470" cy="2571115"/>
+            <wp:effectExtent l="0" t="0" r="0" b="0"/>
+            <wp:docPr id="1713418687" name="Picture 1"/>
+            <wp:cNvGraphicFramePr>
+              <a:graphicFrameLocks xmlns:a="http://schemas.openxmlformats.org/drawingml/2006/main" noChangeAspect="1"/>
+            </wp:cNvGraphicFramePr>
+            <a:graphic xmlns:a="http://schemas.openxmlformats.org/drawingml/2006/main">
+              <a:graphicData uri="http://schemas.openxmlformats.org/drawingml/2006/picture">
+                <pic:pic xmlns:pic="http://schemas.openxmlformats.org/drawingml/2006/picture">
+                  <pic:nvPicPr>
+                    <pic:cNvPr id="1713418687" name=""/>
+                    <pic:cNvPicPr/>
+                  </pic:nvPicPr>
+                  <pic:blipFill>
+                    <a:blip r:embed="rId19"/>
+                    <a:stretch>
+                      <a:fillRect/>
+                    </a:stretch>
+                  </pic:blipFill>
+                  <pic:spPr>
+                    <a:xfrm>
+                      <a:off x="0" y="0"/>
+                      <a:ext cx="6300470" cy="2571115"/>
+                    </a:xfrm>
+                    <a:prstGeom prst="rect">
+                      <a:avLst/>
+                    </a:prstGeom>
+                  </pic:spPr>
+                </pic:pic>
+              </a:graphicData>
+            </a:graphic>
+          </wp:inline>
+        </w:drawing>
+      </w:r>
+    </w:p>
+    <w:p>
+      <w:pPr>
+        <w:pStyle w:val="a"/>
+      </w:pPr>
+      <w:r>
+        <w:t xml:space="preserve">Срабатывание проверки </w:t>
+      </w:r>
+      <w:r>
+        <w:rPr>
+          <w:lang w:val="en-US"/>
+        </w:rPr>
+        <w:t>CRC</w:t>
+      </w:r>
+      <w:r>
+        <w:t xml:space="preserve"> </w:t>
+      </w:r>
+      <w:r>
+        <w:t>при бинарном патчинге программы.</w:t>
+      </w:r>
+    </w:p>
+    <w:p/>
+    <w:p>
+      <w:r>
+        <w:lastRenderedPageBreak/>
+        <w:t xml:space="preserve">Также проверка пароля и целостность </w:t>
+      </w:r>
+      <w:r>
+        <w:rPr>
+          <w:lang w:val="en-US"/>
+        </w:rPr>
+        <w:t>CRC</w:t>
+      </w:r>
+      <w:r>
+        <w:t xml:space="preserve"> </w:t>
+      </w:r>
+      <w:r>
+        <w:t xml:space="preserve">была добавлена в другие места программы, такие как </w:t>
+      </w:r>
+      <w:r>
+        <w:rPr>
+          <w:lang w:val="en-US"/>
+        </w:rPr>
+        <w:t>update</w:t>
+      </w:r>
+      <w:r>
+        <w:t>_</w:t>
+      </w:r>
+      <w:r>
+        <w:rPr>
+          <w:lang w:val="en-US"/>
+        </w:rPr>
+        <w:t>game</w:t>
+      </w:r>
+      <w:r>
+        <w:t xml:space="preserve">(), </w:t>
+      </w:r>
+      <w:r>
+        <w:t>которая вызывается каждый игровой тик и обновляет характеристики игровых объектов, такие как танки, пули и т. д.</w:t>
+      </w:r>
+    </w:p>
+    <w:p/>
+    <w:p>
+      <w:pPr>
+        <w:pStyle w:val="a8"/>
+      </w:pPr>
+      <w:r>
+        <w:rPr>
+          <w:noProof/>
+        </w:rPr>
+        <w:drawing>
+          <wp:inline distT="0" distB="0" distL="0" distR="0" wp14:anchorId="17F89593" wp14:editId="368EDB94">
+            <wp:extent cx="3886742" cy="1124107"/>
+            <wp:effectExtent l="0" t="0" r="0" b="0"/>
+            <wp:docPr id="1974185888" name="Picture 1"/>
+            <wp:cNvGraphicFramePr>
+              <a:graphicFrameLocks xmlns:a="http://schemas.openxmlformats.org/drawingml/2006/main" noChangeAspect="1"/>
+            </wp:cNvGraphicFramePr>
+            <a:graphic xmlns:a="http://schemas.openxmlformats.org/drawingml/2006/main">
+              <a:graphicData uri="http://schemas.openxmlformats.org/drawingml/2006/picture">
+                <pic:pic xmlns:pic="http://schemas.openxmlformats.org/drawingml/2006/picture">
+                  <pic:nvPicPr>
+                    <pic:cNvPr id="1974185888" name=""/>
+                    <pic:cNvPicPr/>
+                  </pic:nvPicPr>
+                  <pic:blipFill>
+                    <a:blip r:embed="rId20"/>
+                    <a:stretch>
+                      <a:fillRect/>
+                    </a:stretch>
+                  </pic:blipFill>
+                  <pic:spPr>
+                    <a:xfrm>
+                      <a:off x="0" y="0"/>
+                      <a:ext cx="3886742" cy="1124107"/>
+                    </a:xfrm>
+                    <a:prstGeom prst="rect">
+                      <a:avLst/>
+                    </a:prstGeom>
+                  </pic:spPr>
+                </pic:pic>
+              </a:graphicData>
+            </a:graphic>
+          </wp:inline>
+        </w:drawing>
+      </w:r>
+    </w:p>
+    <w:p>
+      <w:pPr>
+        <w:pStyle w:val="a"/>
+      </w:pPr>
+      <w:r>
+        <w:t xml:space="preserve">Функция проверки пароля и </w:t>
+      </w:r>
+      <w:r>
+        <w:rPr>
+          <w:lang w:val="en-US"/>
+        </w:rPr>
+        <w:t>CRC</w:t>
+      </w:r>
+      <w:r>
+        <w:t>.</w:t>
+      </w:r>
+    </w:p>
+    <w:p/>
+    <w:p>
+      <w:pPr>
+        <w:pStyle w:val="a8"/>
+        <w:rPr>
+          <w:lang w:val="en-US"/>
+        </w:rPr>
+      </w:pPr>
+      <w:r>
+        <w:rPr>
+          <w:noProof/>
+          <w:lang w:val="en-US"/>
+        </w:rPr>
+        <w:drawing>
+          <wp:inline distT="0" distB="0" distL="0" distR="0" wp14:anchorId="1350B0A9" wp14:editId="1995ED48">
+            <wp:extent cx="6144482" cy="1267002"/>
+            <wp:effectExtent l="0" t="0" r="0" b="9525"/>
+            <wp:docPr id="1180680379" name="Picture 1"/>
+            <wp:cNvGraphicFramePr>
+              <a:graphicFrameLocks xmlns:a="http://schemas.openxmlformats.org/drawingml/2006/main" noChangeAspect="1"/>
+            </wp:cNvGraphicFramePr>
+            <a:graphic xmlns:a="http://schemas.openxmlformats.org/drawingml/2006/main">
+              <a:graphicData uri="http://schemas.openxmlformats.org/drawingml/2006/picture">
+                <pic:pic xmlns:pic="http://schemas.openxmlformats.org/drawingml/2006/picture">
+                  <pic:nvPicPr>
+                    <pic:cNvPr id="1180680379" name=""/>
+                    <pic:cNvPicPr/>
+                  </pic:nvPicPr>
+                  <pic:blipFill>
+                    <a:blip r:embed="rId21"/>
+                    <a:stretch>
+                      <a:fillRect/>
+                    </a:stretch>
+                  </pic:blipFill>
+                  <pic:spPr>
+                    <a:xfrm>
+                      <a:off x="0" y="0"/>
+                      <a:ext cx="6144482" cy="1267002"/>
+                    </a:xfrm>
+                    <a:prstGeom prst="rect">
+                      <a:avLst/>
+                    </a:prstGeom>
+                  </pic:spPr>
+                </pic:pic>
+              </a:graphicData>
+            </a:graphic>
+          </wp:inline>
+        </w:drawing>
+      </w:r>
+    </w:p>
+    <w:p>
+      <w:pPr>
+        <w:pStyle w:val="a"/>
+      </w:pPr>
+      <w:r>
+        <w:t>Проверка пароля в другом месте программы.</w:t>
+      </w:r>
+    </w:p>
+    <w:p/>
+    <w:p>
+      <w:r>
+        <w:t xml:space="preserve">Такие проверки были добавлены во все функции обновления элементов игры, такие как пули, улучшения, </w:t>
+      </w:r>
+      <w:r>
+        <w:t>частицы, а также проверка находится в функции генерации карты</w:t>
+      </w:r>
+      <w:r>
+        <w:t xml:space="preserve"> </w:t>
+      </w:r>
+      <w:r>
+        <w:rPr>
+          <w:lang w:val="en-US"/>
+        </w:rPr>
+        <w:t>generate</w:t>
+      </w:r>
+      <w:r>
+        <w:t>_</w:t>
+      </w:r>
+      <w:r>
+        <w:rPr>
+          <w:lang w:val="en-US"/>
+        </w:rPr>
+        <w:t>map</w:t>
+      </w:r>
+      <w:r>
+        <w:t>().</w:t>
+      </w:r>
+    </w:p>
+    <w:p/>
+    <w:p>
+      <w:pPr>
+        <w:pStyle w:val="a8"/>
+      </w:pPr>
+      <w:r>
+        <w:rPr>
+          <w:noProof/>
+        </w:rPr>
+        <w:lastRenderedPageBreak/>
+        <w:drawing>
+          <wp:inline distT="0" distB="0" distL="0" distR="0" wp14:anchorId="5F5943BF" wp14:editId="0E896EB8">
+            <wp:extent cx="6300470" cy="3094990"/>
+            <wp:effectExtent l="0" t="0" r="0" b="0"/>
+            <wp:docPr id="674320834" name="Picture 1"/>
+            <wp:cNvGraphicFramePr>
+              <a:graphicFrameLocks xmlns:a="http://schemas.openxmlformats.org/drawingml/2006/main" noChangeAspect="1"/>
+            </wp:cNvGraphicFramePr>
+            <a:graphic xmlns:a="http://schemas.openxmlformats.org/drawingml/2006/main">
+              <a:graphicData uri="http://schemas.openxmlformats.org/drawingml/2006/picture">
+                <pic:pic xmlns:pic="http://schemas.openxmlformats.org/drawingml/2006/picture">
+                  <pic:nvPicPr>
+                    <pic:cNvPr id="674320834" name=""/>
+                    <pic:cNvPicPr/>
+                  </pic:nvPicPr>
+                  <pic:blipFill>
+                    <a:blip r:embed="rId22"/>
+                    <a:stretch>
+                      <a:fillRect/>
+                    </a:stretch>
+                  </pic:blipFill>
+                  <pic:spPr>
+                    <a:xfrm>
+                      <a:off x="0" y="0"/>
+                      <a:ext cx="6300470" cy="3094990"/>
+                    </a:xfrm>
+                    <a:prstGeom prst="rect">
+                      <a:avLst/>
+                    </a:prstGeom>
+                  </pic:spPr>
+                </pic:pic>
+              </a:graphicData>
+            </a:graphic>
+          </wp:inline>
+        </w:drawing>
+      </w:r>
+    </w:p>
+    <w:p>
+      <w:pPr>
+        <w:pStyle w:val="a"/>
+      </w:pPr>
+      <w:r>
+        <w:t xml:space="preserve">Проверка пароля в </w:t>
+      </w:r>
+      <w:r>
+        <w:rPr>
+          <w:lang w:val="en-US"/>
+        </w:rPr>
+        <w:t>generate</w:t>
+      </w:r>
+      <w:r>
+        <w:t>_</w:t>
+      </w:r>
+      <w:r>
+        <w:rPr>
+          <w:lang w:val="en-US"/>
+        </w:rPr>
+        <w:t>map</w:t>
+      </w:r>
+      <w:r>
+        <w:t>()</w:t>
+      </w:r>
+    </w:p>
+    <w:p/>
+    <w:p>
+      <w:r>
+        <w:t xml:space="preserve">Также были добавлены ложные проверки пароля. В них пароль из </w:t>
+      </w:r>
+      <w:r>
+        <w:rPr>
+          <w:lang w:val="en-US"/>
+        </w:rPr>
+        <w:t>password</w:t>
+      </w:r>
+      <w:r>
+        <w:t>.</w:t>
+      </w:r>
+      <w:r>
+        <w:rPr>
+          <w:lang w:val="en-US"/>
+        </w:rPr>
+        <w:t>txt</w:t>
+      </w:r>
+      <w:r>
+        <w:t xml:space="preserve"> </w:t>
+      </w:r>
+      <w:r>
+        <w:t>сравнивается с зашифрованным паролем. Вызовы данных ложных проверок создают орграф без контуров, чтобы избежать бесконечного цикла вызова функций. Данные проверки служат для увеличения количества ложных условных переходов и усложнения дебага программы.</w:t>
+      </w:r>
+    </w:p>
+    <w:p/>
+    <w:p>
+      <w:pPr>
+        <w:pStyle w:val="a8"/>
+      </w:pPr>
+      <w:r>
+        <w:rPr>
+          <w:noProof/>
+        </w:rPr>
+        <w:lastRenderedPageBreak/>
+        <w:drawing>
+          <wp:inline distT="0" distB="0" distL="0" distR="0" wp14:anchorId="35CE459B" wp14:editId="3DEEFBB2">
+            <wp:extent cx="6300470" cy="7255510"/>
+            <wp:effectExtent l="0" t="0" r="0" b="0"/>
+            <wp:docPr id="2051613197" name="Picture 1"/>
+            <wp:cNvGraphicFramePr>
+              <a:graphicFrameLocks xmlns:a="http://schemas.openxmlformats.org/drawingml/2006/main" noChangeAspect="1"/>
+            </wp:cNvGraphicFramePr>
+            <a:graphic xmlns:a="http://schemas.openxmlformats.org/drawingml/2006/main">
+              <a:graphicData uri="http://schemas.openxmlformats.org/drawingml/2006/picture">
+                <pic:pic xmlns:pic="http://schemas.openxmlformats.org/drawingml/2006/picture">
+                  <pic:nvPicPr>
+                    <pic:cNvPr id="2051613197" name=""/>
+                    <pic:cNvPicPr/>
+                  </pic:nvPicPr>
+                  <pic:blipFill>
+                    <a:blip r:embed="rId23"/>
+                    <a:stretch>
+                      <a:fillRect/>
+                    </a:stretch>
+                  </pic:blipFill>
+                  <pic:spPr>
+                    <a:xfrm>
+                      <a:off x="0" y="0"/>
+                      <a:ext cx="6300470" cy="7255510"/>
+                    </a:xfrm>
+                    <a:prstGeom prst="rect">
+                      <a:avLst/>
+                    </a:prstGeom>
+                  </pic:spPr>
+                </pic:pic>
+              </a:graphicData>
+            </a:graphic>
+          </wp:inline>
+        </w:drawing>
+      </w:r>
+    </w:p>
+    <w:p>
+      <w:pPr>
+        <w:pStyle w:val="a"/>
+      </w:pPr>
+      <w:r>
+        <w:t>Ложные проверки пароля.</w:t>
+      </w:r>
+    </w:p>
+    <w:p/>
+    <w:p>
+      <w:r>
+        <w:t>Данные ложные проверки также служат для запутывания кода и создания графа условых переходов, что запутывает код и усложняет анализ программы.</w:t>
+      </w:r>
+      <w:r>
+        <w:t xml:space="preserve"> </w:t>
+      </w:r>
+      <w:r>
+        <w:t>Вариации ложных проверок были размещены в различных местах проекта.</w:t>
+      </w:r>
+      <w:r>
+        <w:t xml:space="preserve"> </w:t>
+      </w:r>
+      <w:r>
+        <w:lastRenderedPageBreak/>
+        <w:t>Создание таких ложных проверок является методом противодействия дизасемблированию, так как может увеличить и запутать граф дизасемблера.</w:t>
+      </w:r>
+    </w:p>
+    <w:p/>
+    <w:p>
+      <w:r>
+        <w:t xml:space="preserve">Одним из способов противодействия средствам отладки является функция </w:t>
+      </w:r>
+      <w:r>
+        <w:t>IsDebuggerPresent()</w:t>
+      </w:r>
+      <w:r>
+        <w:t xml:space="preserve">, которая проверяет флаг </w:t>
+      </w:r>
+      <w:proofErr w:type="spellStart"/>
+      <w:r>
+        <w:rPr>
+          <w:lang w:val="en-US"/>
+        </w:rPr>
+        <w:t>BeingDebugged</w:t>
+      </w:r>
+      <w:proofErr w:type="spellEnd"/>
+      <w:r>
+        <w:t xml:space="preserve"> </w:t>
+      </w:r>
+      <w:r>
+        <w:t xml:space="preserve">в структуре </w:t>
+      </w:r>
+      <w:r>
+        <w:rPr>
+          <w:lang w:val="en-US"/>
+        </w:rPr>
+        <w:t>PEB</w:t>
+      </w:r>
+      <w:r>
+        <w:t xml:space="preserve"> </w:t>
+      </w:r>
+      <w:r>
+        <w:t xml:space="preserve">процесса, если она вернет </w:t>
+      </w:r>
+      <w:r>
+        <w:t xml:space="preserve">0, </w:t>
+      </w:r>
+      <w:r>
+        <w:t>то отладка не была обнаружена, в противном случае была обнаружена отладка.</w:t>
+      </w:r>
+    </w:p>
+    <w:p>
+      <w:r>
+        <w:t xml:space="preserve">Также для противодействия отладке используется </w:t>
+      </w:r>
+      <w:proofErr w:type="spellStart"/>
+      <w:r>
+        <w:rPr>
+          <w:lang w:val="en-US"/>
+        </w:rPr>
+        <w:t>CheckRemoteDebuggerPresent</w:t>
+      </w:r>
+      <w:proofErr w:type="spellEnd"/>
+      <w:r>
+        <w:t xml:space="preserve">(), </w:t>
+      </w:r>
+      <w:r>
+        <w:t xml:space="preserve">которая </w:t>
+      </w:r>
+      <w:r>
+        <w:t xml:space="preserve">использует </w:t>
+      </w:r>
+      <w:proofErr w:type="spellStart"/>
+      <w:r>
+        <w:rPr>
+          <w:lang w:val="en-US"/>
+        </w:rPr>
+        <w:t>NtQueryInformationProcess</w:t>
+      </w:r>
+      <w:proofErr w:type="spellEnd"/>
+      <w:r>
+        <w:t>(), проверяющее наличие порта отладки для процесса</w:t>
+      </w:r>
+      <w:r>
+        <w:t>.</w:t>
+      </w:r>
+    </w:p>
+    <w:p>
+      <w:r>
+        <w:t>Еще была добавлена проверка по времени, которая замеряет время, выполняет цикл в 10 итераций и затем замеряет время и вычисляет разницу. Если на выполнение цикла было потрачено более 10 тиков, то это говорит о наличии отладки</w:t>
+      </w:r>
+      <w:r>
+        <w:t>.</w:t>
+      </w:r>
+    </w:p>
+    <w:p>
+      <w:r>
+        <w:t>Вдобавок, существует проверка</w:t>
+      </w:r>
+      <w:r>
+        <w:t xml:space="preserve"> </w:t>
+      </w:r>
+      <w:r>
+        <w:t xml:space="preserve">поля </w:t>
+      </w:r>
+      <w:proofErr w:type="spellStart"/>
+      <w:r>
+        <w:rPr>
+          <w:lang w:val="en-US"/>
+        </w:rPr>
+        <w:t>NtGlobalFlag</w:t>
+      </w:r>
+      <w:proofErr w:type="spellEnd"/>
+      <w:r>
+        <w:t xml:space="preserve">, </w:t>
+      </w:r>
+      <w:r>
+        <w:t xml:space="preserve">где флаги кучи образуют маску </w:t>
+      </w:r>
+      <w:r>
+        <w:t>0</w:t>
+      </w:r>
+      <w:r>
+        <w:rPr>
+          <w:lang w:val="en-US"/>
+        </w:rPr>
+        <w:t>x</w:t>
+      </w:r>
+      <w:r>
+        <w:t>70</w:t>
+      </w:r>
+      <w:r>
+        <w:t xml:space="preserve">. Если маска </w:t>
+      </w:r>
+      <w:proofErr w:type="spellStart"/>
+      <w:r>
+        <w:rPr>
+          <w:lang w:val="en-US"/>
+        </w:rPr>
+        <w:t>NtGlobalFlag</w:t>
+      </w:r>
+      <w:proofErr w:type="spellEnd"/>
+      <w:r>
+        <w:t xml:space="preserve"> </w:t>
+      </w:r>
+      <w:r>
+        <w:t xml:space="preserve">отличается от </w:t>
+      </w:r>
+      <w:r>
+        <w:t>0</w:t>
+      </w:r>
+      <w:r>
+        <w:rPr>
+          <w:lang w:val="en-US"/>
+        </w:rPr>
+        <w:t>x</w:t>
+      </w:r>
+      <w:r>
+        <w:t xml:space="preserve">70, </w:t>
+      </w:r>
+      <w:r>
+        <w:t>то можно предположить, что запущен отладчик.</w:t>
+      </w:r>
+    </w:p>
+    <w:p>
+      <w:r>
+        <w:t>Еще есть метод проверки отладки по открытым окнам, в проверке изначально записаны названия окон известных отладчиков в зашифрованном виде, потом проверяются окна с данными названиями.</w:t>
+      </w:r>
+    </w:p>
+    <w:p>
+      <w:r>
+        <w:t xml:space="preserve">В результате функция проверки </w:t>
+      </w:r>
+      <w:r>
+        <w:rPr>
+          <w:lang w:val="en-US"/>
+        </w:rPr>
+        <w:t>serial</w:t>
+      </w:r>
+      <w:r>
+        <w:t xml:space="preserve">() </w:t>
+      </w:r>
+      <w:r>
+        <w:t>была дополнена обнаружением отлдадчиков.</w:t>
+      </w:r>
+    </w:p>
+    <w:p/>
+    <w:p>
+      <w:pPr>
+        <w:pStyle w:val="a8"/>
+      </w:pPr>
+      <w:r>
+        <w:rPr>
+          <w:noProof/>
+        </w:rPr>
+        <w:drawing>
+          <wp:inline distT="0" distB="0" distL="0" distR="0" wp14:anchorId="1973496F" wp14:editId="5AB25DE9">
+            <wp:extent cx="6300470" cy="1350645"/>
+            <wp:effectExtent l="0" t="0" r="0" b="0"/>
+            <wp:docPr id="2023411841" name="Picture 1"/>
+            <wp:cNvGraphicFramePr>
+              <a:graphicFrameLocks xmlns:a="http://schemas.openxmlformats.org/drawingml/2006/main" noChangeAspect="1"/>
+            </wp:cNvGraphicFramePr>
+            <a:graphic xmlns:a="http://schemas.openxmlformats.org/drawingml/2006/main">
+              <a:graphicData uri="http://schemas.openxmlformats.org/drawingml/2006/picture">
+                <pic:pic xmlns:pic="http://schemas.openxmlformats.org/drawingml/2006/picture">
+                  <pic:nvPicPr>
+                    <pic:cNvPr id="2023411841" name=""/>
+                    <pic:cNvPicPr/>
+                  </pic:nvPicPr>
+                  <pic:blipFill>
+                    <a:blip r:embed="rId24"/>
+                    <a:stretch>
+                      <a:fillRect/>
+                    </a:stretch>
+                  </pic:blipFill>
+                  <pic:spPr>
+                    <a:xfrm>
+                      <a:off x="0" y="0"/>
+                      <a:ext cx="6300470" cy="1350645"/>
+                    </a:xfrm>
+                    <a:prstGeom prst="rect">
+                      <a:avLst/>
+                    </a:prstGeom>
+                  </pic:spPr>
+                </pic:pic>
+              </a:graphicData>
+            </a:graphic>
+          </wp:inline>
+        </w:drawing>
+      </w:r>
+    </w:p>
+    <w:p>
+      <w:pPr>
+        <w:pStyle w:val="a"/>
+      </w:pPr>
+      <w:r>
+        <w:t>Добавление проверки отладчиков в фунуцию проверки</w:t>
+      </w:r>
+    </w:p>
+    <w:p/>
+    <w:p>
+      <w:r>
+        <w:lastRenderedPageBreak/>
+        <w:t xml:space="preserve">Для противодействия </w:t>
+      </w:r>
+      <w:r>
+        <w:t>виртуальным машинам используются такие методы как: проверка драйверов виртуальных машин, провервка ключей виртуальный машин в реестре,..</w:t>
+      </w:r>
+    </w:p>
+    <w:p>
+      <w:r>
+        <w:t xml:space="preserve">Для проверки драйверов вирутальных машин была реализована функция </w:t>
+      </w:r>
+      <w:r>
+        <w:rPr>
+          <w:lang w:val="en-US"/>
+        </w:rPr>
+        <w:t>Check</w:t>
+      </w:r>
+      <w:r>
+        <w:t>_</w:t>
+      </w:r>
+      <w:r>
+        <w:rPr>
+          <w:lang w:val="en-US"/>
+        </w:rPr>
+        <w:t>VM</w:t>
+      </w:r>
+      <w:r>
+        <w:t>_</w:t>
+      </w:r>
+      <w:r>
+        <w:rPr>
+          <w:lang w:val="en-US"/>
+        </w:rPr>
+        <w:t>files</w:t>
+      </w:r>
+      <w:r>
+        <w:t xml:space="preserve">(), </w:t>
+      </w:r>
+      <w:r>
+        <w:t>в которой хранятся пути к нескольким драйверам известных виртуальных машин. Они представлены ниже</w:t>
+      </w:r>
+    </w:p>
+    <w:p>
+      <w:pPr>
+        <w:pStyle w:val="a6"/>
+      </w:pPr>
+      <w:r>
+        <w:t>C:\Windows\System32\drivers\VBoxGuest.sys</w:t>
+      </w:r>
+    </w:p>
+    <w:p>
+      <w:pPr>
+        <w:pStyle w:val="a6"/>
+      </w:pPr>
+      <w:r>
+        <w:t>C:\Windows\System32\drivers\VBoxMouse.sys</w:t>
+      </w:r>
+    </w:p>
+    <w:p>
+      <w:pPr>
+        <w:pStyle w:val="a6"/>
+      </w:pPr>
+      <w:r>
+        <w:t>C:\Windows\System32\drivers\vmmouse.sys</w:t>
+      </w:r>
+    </w:p>
+    <w:p>
+      <w:pPr>
+        <w:pStyle w:val="a6"/>
+      </w:pPr>
+      <w:r>
+        <w:t>C:\Windows\System32\drivers\vmhgfs.sys</w:t>
+      </w:r>
+    </w:p>
+    <w:p>
+      <w:pPr>
+        <w:pStyle w:val="a6"/>
+        <w:rPr>
+          <w:lang w:val="ru-RU"/>
+        </w:rPr>
+      </w:pPr>
+      <w:r>
+        <w:t>C:\Program Files\Oracle\VirtualBox Guest Additions</w:t>
+      </w:r>
+    </w:p>
+    <w:p>
+      <w:r>
+        <w:t xml:space="preserve">Данные пути хранятся в зашифрованном виде и проверяются на наличие, используя </w:t>
+      </w:r>
+      <w:proofErr w:type="spellStart"/>
+      <w:r>
+        <w:rPr>
+          <w:lang w:val="en-US"/>
+        </w:rPr>
+        <w:t>GetFileAttributes</w:t>
+      </w:r>
+      <w:proofErr w:type="spellEnd"/>
+      <w:r>
+        <w:t>()</w:t>
+      </w:r>
+    </w:p>
+    <w:p/>
+    <w:p>
+      <w:pPr>
+        <w:pStyle w:val="a8"/>
+        <w:rPr>
+          <w:lang w:val="en-US"/>
+        </w:rPr>
+      </w:pPr>
+      <w:r>
+        <w:drawing>
+          <wp:inline distT="0" distB="0" distL="0" distR="0" wp14:anchorId="054BA807" wp14:editId="0BA76727">
+            <wp:extent cx="6300470" cy="4075430"/>
+            <wp:effectExtent l="0" t="0" r="0" b="0"/>
+            <wp:docPr id="795875102" name="Picture 1"/>
+            <wp:cNvGraphicFramePr>
+              <a:graphicFrameLocks xmlns:a="http://schemas.openxmlformats.org/drawingml/2006/main" noChangeAspect="1"/>
+            </wp:cNvGraphicFramePr>
+            <a:graphic xmlns:a="http://schemas.openxmlformats.org/drawingml/2006/main">
+              <a:graphicData uri="http://schemas.openxmlformats.org/drawingml/2006/picture">
+                <pic:pic xmlns:pic="http://schemas.openxmlformats.org/drawingml/2006/picture">
+                  <pic:nvPicPr>
+                    <pic:cNvPr id="795875102" name=""/>
+                    <pic:cNvPicPr/>
+                  </pic:nvPicPr>
+                  <pic:blipFill>
+                    <a:blip r:embed="rId25"/>
+                    <a:stretch>
+                      <a:fillRect/>
+                    </a:stretch>
+                  </pic:blipFill>
+                  <pic:spPr>
+                    <a:xfrm>
+                      <a:off x="0" y="0"/>
+                      <a:ext cx="6300470" cy="4075430"/>
+                    </a:xfrm>
+                    <a:prstGeom prst="rect">
+                      <a:avLst/>
+                    </a:prstGeom>
+                  </pic:spPr>
+                </pic:pic>
+              </a:graphicData>
+            </a:graphic>
+          </wp:inline>
+        </w:drawing>
+      </w:r>
+    </w:p>
+    <w:p>
+      <w:pPr>
+        <w:pStyle w:val="a"/>
+      </w:pPr>
+      <w:r>
+        <w:t>Проверка драйверов виртуальных машин</w:t>
+      </w:r>
+    </w:p>
+    <w:p>
+      <w:pPr>
+        <w:rPr>
+          <w:lang w:val="en-US"/>
+        </w:rPr>
+      </w:pPr>
+    </w:p>
+    <w:p>
+      <w:r>
+        <w:lastRenderedPageBreak/>
+        <w:t>Также</w:t>
+      </w:r>
+      <w:r>
+        <w:t xml:space="preserve"> </w:t>
+      </w:r>
+      <w:r>
+        <w:t>можно</w:t>
+      </w:r>
+      <w:r>
+        <w:t xml:space="preserve"> </w:t>
+      </w:r>
+      <w:r>
+        <w:t>определить</w:t>
+      </w:r>
+      <w:r>
+        <w:t xml:space="preserve"> </w:t>
+      </w:r>
+      <w:r>
+        <w:t>виртуальную</w:t>
+      </w:r>
+      <w:r>
+        <w:t xml:space="preserve"> </w:t>
+      </w:r>
+      <w:r>
+        <w:t>машину</w:t>
+      </w:r>
+      <w:r>
+        <w:t xml:space="preserve"> </w:t>
+      </w:r>
+      <w:r>
+        <w:t>по</w:t>
+      </w:r>
+      <w:r>
+        <w:t xml:space="preserve"> </w:t>
+      </w:r>
+      <w:r>
+        <w:t>ключу</w:t>
+      </w:r>
+      <w:r>
+        <w:t xml:space="preserve"> </w:t>
+      </w:r>
+      <w:r>
+        <w:t>в</w:t>
+      </w:r>
+      <w:r>
+        <w:t xml:space="preserve"> </w:t>
+      </w:r>
+      <w:r>
+        <w:t>реестре</w:t>
+      </w:r>
+      <w:r>
+        <w:t xml:space="preserve">, </w:t>
+      </w:r>
+      <w:r>
+        <w:t>зачастую</w:t>
+      </w:r>
+      <w:r>
+        <w:t xml:space="preserve"> </w:t>
+      </w:r>
+      <w:r>
+        <w:t>это</w:t>
+      </w:r>
+      <w:r>
+        <w:t xml:space="preserve"> </w:t>
+      </w:r>
+      <w:r>
+        <w:t>ключ</w:t>
+      </w:r>
+      <w:r>
+        <w:t xml:space="preserve"> </w:t>
+      </w:r>
+      <w:r>
+        <w:t>вида:</w:t>
+      </w:r>
+    </w:p>
+    <w:p>
+      <w:pPr>
+        <w:pStyle w:val="a6"/>
+        <w:rPr>
+          <w:lang w:val="ru-RU"/>
+        </w:rPr>
+      </w:pPr>
+      <w:r>
+        <w:t>SYSTEM\CurrentControlSet\Enum\PCI\VEN_15AD&amp;DEV_0405&amp;SUBSYS_040515AD&amp;REV_00</w:t>
+      </w:r>
+    </w:p>
+    <w:p>
+      <w:pPr>
         <w:ind w:firstLine="0"/>
-        <w:rPr>
-          <w:rFonts w:eastAsia="Times New Roman" w:cs="Times New Roman"/>
-        </w:rPr>
-      </w:pPr>
-    </w:p>
+      </w:pPr>
+      <w:r>
+        <w:tab/>
+        <w:t xml:space="preserve">Данный ключ является путем к виртуальной видеокарте </w:t>
+      </w:r>
+      <w:r>
+        <w:rPr>
+          <w:lang w:val="en-US"/>
+        </w:rPr>
+        <w:t>VMWare</w:t>
+      </w:r>
+      <w:r>
+        <w:t xml:space="preserve">. </w:t>
+      </w:r>
+      <w:r>
+        <w:t xml:space="preserve">На это указывает идентификатор производителя </w:t>
+      </w:r>
+      <w:r>
+        <w:t>(15</w:t>
+      </w:r>
+      <w:r>
+        <w:rPr>
+          <w:lang w:val="en-US"/>
+        </w:rPr>
+        <w:t>AD</w:t>
+      </w:r>
+      <w:r>
+        <w:t xml:space="preserve"> </w:t>
+      </w:r>
+      <w:r>
+        <w:t xml:space="preserve">принадлежит </w:t>
+      </w:r>
+      <w:r>
+        <w:rPr>
+          <w:lang w:val="en-US"/>
+        </w:rPr>
+        <w:t>VMWare</w:t>
+      </w:r>
+      <w:r>
+        <w:t>)</w:t>
+      </w:r>
+      <w:r>
+        <w:t>.</w:t>
+      </w:r>
+    </w:p>
+    <w:p/>
+    <w:p>
+      <w:pPr>
+        <w:pStyle w:val="a8"/>
+      </w:pPr>
+      <w:r>
+        <w:drawing>
+          <wp:inline distT="0" distB="0" distL="0" distR="0" wp14:anchorId="2E15DE0D" wp14:editId="1E44CFF2">
+            <wp:extent cx="6300470" cy="2159635"/>
+            <wp:effectExtent l="0" t="0" r="0" b="0"/>
+            <wp:docPr id="1534843198" name="Picture 1"/>
+            <wp:cNvGraphicFramePr>
+              <a:graphicFrameLocks xmlns:a="http://schemas.openxmlformats.org/drawingml/2006/main" noChangeAspect="1"/>
+            </wp:cNvGraphicFramePr>
+            <a:graphic xmlns:a="http://schemas.openxmlformats.org/drawingml/2006/main">
+              <a:graphicData uri="http://schemas.openxmlformats.org/drawingml/2006/picture">
+                <pic:pic xmlns:pic="http://schemas.openxmlformats.org/drawingml/2006/picture">
+                  <pic:nvPicPr>
+                    <pic:cNvPr id="1534843198" name=""/>
+                    <pic:cNvPicPr/>
+                  </pic:nvPicPr>
+                  <pic:blipFill>
+                    <a:blip r:embed="rId26"/>
+                    <a:stretch>
+                      <a:fillRect/>
+                    </a:stretch>
+                  </pic:blipFill>
+                  <pic:spPr>
+                    <a:xfrm>
+                      <a:off x="0" y="0"/>
+                      <a:ext cx="6300470" cy="2159635"/>
+                    </a:xfrm>
+                    <a:prstGeom prst="rect">
+                      <a:avLst/>
+                    </a:prstGeom>
+                  </pic:spPr>
+                </pic:pic>
+              </a:graphicData>
+            </a:graphic>
+          </wp:inline>
+        </w:drawing>
+      </w:r>
+    </w:p>
+    <w:p>
+      <w:pPr>
+        <w:pStyle w:val="a"/>
+      </w:pPr>
+      <w:r>
+        <w:t xml:space="preserve">Проверка ключа виртуальной видеокарты </w:t>
+      </w:r>
+      <w:r>
+        <w:rPr>
+          <w:lang w:val="en-US"/>
+        </w:rPr>
+        <w:t>VMWare</w:t>
+      </w:r>
+    </w:p>
+    <w:p>
+      <w:r>
+        <w:t xml:space="preserve">Также реализована проверка в таблице </w:t>
+      </w:r>
+      <w:r>
+        <w:t>SMBIOS</w:t>
+      </w:r>
+      <w:r>
+        <w:t xml:space="preserve"> на наличие сигнатур виртуальных машин. Сами сигратуры записаны в зашифрованом виде. Сама </w:t>
+      </w:r>
+      <w:r>
+        <w:rPr>
+          <w:lang w:val="en-US"/>
+        </w:rPr>
+        <w:t>SMBIOS</w:t>
+      </w:r>
+      <w:r>
+        <w:t xml:space="preserve"> </w:t>
+      </w:r>
+      <w:r>
+        <w:t>таблица сначала вызывается, чтобы получить ее размер, потом под нее выделяется память и дальнейший вызов сохраняет всю таблицу, в которой побайтово проверяется наличие сигнатур виртуальной машины.</w:t>
+      </w:r>
+    </w:p>
+    <w:p/>
+    <w:p>
+      <w:pPr>
+        <w:pStyle w:val="a8"/>
+      </w:pPr>
+      <w:r>
+        <w:lastRenderedPageBreak/>
+        <w:drawing>
+          <wp:inline distT="0" distB="0" distL="0" distR="0" wp14:anchorId="661CB724" wp14:editId="7C616452">
+            <wp:extent cx="6300470" cy="7445375"/>
+            <wp:effectExtent l="0" t="0" r="0" b="0"/>
+            <wp:docPr id="760942979" name="Picture 1"/>
+            <wp:cNvGraphicFramePr>
+              <a:graphicFrameLocks xmlns:a="http://schemas.openxmlformats.org/drawingml/2006/main" noChangeAspect="1"/>
+            </wp:cNvGraphicFramePr>
+            <a:graphic xmlns:a="http://schemas.openxmlformats.org/drawingml/2006/main">
+              <a:graphicData uri="http://schemas.openxmlformats.org/drawingml/2006/picture">
+                <pic:pic xmlns:pic="http://schemas.openxmlformats.org/drawingml/2006/picture">
+                  <pic:nvPicPr>
+                    <pic:cNvPr id="760942979" name=""/>
+                    <pic:cNvPicPr/>
+                  </pic:nvPicPr>
+                  <pic:blipFill>
+                    <a:blip r:embed="rId27"/>
+                    <a:stretch>
+                      <a:fillRect/>
+                    </a:stretch>
+                  </pic:blipFill>
+                  <pic:spPr>
+                    <a:xfrm>
+                      <a:off x="0" y="0"/>
+                      <a:ext cx="6300470" cy="7445375"/>
+                    </a:xfrm>
+                    <a:prstGeom prst="rect">
+                      <a:avLst/>
+                    </a:prstGeom>
+                  </pic:spPr>
+                </pic:pic>
+              </a:graphicData>
+            </a:graphic>
+          </wp:inline>
+        </w:drawing>
+      </w:r>
+    </w:p>
+    <w:p>
+      <w:pPr>
+        <w:pStyle w:val="a"/>
+      </w:pPr>
+      <w:r>
+        <w:t xml:space="preserve">Проверка наличия сигнатур ВМ в </w:t>
+      </w:r>
+      <w:r>
+        <w:rPr>
+          <w:lang w:val="en-US"/>
+        </w:rPr>
+        <w:t>SMBIOS</w:t>
+      </w:r>
+      <w:r>
+        <w:t xml:space="preserve"> </w:t>
+      </w:r>
+      <w:r>
+        <w:t>таблице.</w:t>
+      </w:r>
+    </w:p>
+    <w:p/>
+    <w:p/>
+    <w:p/>
+    <w:p/>
+    <w:p/>
+    <w:p/>
+    <w:p/>
+    <w:p>
+      <w:pPr>
+        <w:pStyle w:val="a8"/>
+        <w:rPr>
+          <w:lang w:val="en-US"/>
+        </w:rPr>
+      </w:pPr>
+      <w:r>
+        <w:rPr>
+          <w:lang w:val="en-US"/>
+        </w:rPr>
+        <w:drawing>
+          <wp:inline distT="0" distB="0" distL="0" distR="0" wp14:anchorId="42797872" wp14:editId="490E94AA">
+            <wp:extent cx="6173061" cy="1952898"/>
+            <wp:effectExtent l="0" t="0" r="0" b="9525"/>
+            <wp:docPr id="243716981" name="Picture 1"/>
+            <wp:cNvGraphicFramePr>
+              <a:graphicFrameLocks xmlns:a="http://schemas.openxmlformats.org/drawingml/2006/main" noChangeAspect="1"/>
+            </wp:cNvGraphicFramePr>
+            <a:graphic xmlns:a="http://schemas.openxmlformats.org/drawingml/2006/main">
+              <a:graphicData uri="http://schemas.openxmlformats.org/drawingml/2006/picture">
+                <pic:pic xmlns:pic="http://schemas.openxmlformats.org/drawingml/2006/picture">
+                  <pic:nvPicPr>
+                    <pic:cNvPr id="243716981" name=""/>
+                    <pic:cNvPicPr/>
+                  </pic:nvPicPr>
+                  <pic:blipFill>
+                    <a:blip r:embed="rId28"/>
+                    <a:stretch>
+                      <a:fillRect/>
+                    </a:stretch>
+                  </pic:blipFill>
+                  <pic:spPr>
+                    <a:xfrm>
+                      <a:off x="0" y="0"/>
+                      <a:ext cx="6173061" cy="1952898"/>
+                    </a:xfrm>
+                    <a:prstGeom prst="rect">
+                      <a:avLst/>
+                    </a:prstGeom>
+                  </pic:spPr>
+                </pic:pic>
+              </a:graphicData>
+            </a:graphic>
+          </wp:inline>
+        </w:drawing>
+      </w:r>
+    </w:p>
+    <w:p/>
+    <w:p/>
+    <w:p>
+      <w:pPr>
+        <w:ind w:firstLine="0"/>
+      </w:pPr>
+    </w:p>
+    <w:p/>
+    <w:p/>
+    <w:p/>
     <w:sectPr>
-      <w:headerReference w:type="even" r:id="rId8"/>
-      <w:headerReference w:type="default" r:id="rId9"/>
-      <w:footerReference w:type="even" r:id="rId10"/>
-      <w:footerReference w:type="default" r:id="rId11"/>
-      <w:headerReference w:type="first" r:id="rId12"/>
-      <w:footerReference w:type="first" r:id="rId13"/>
+      <w:headerReference w:type="even" r:id="rId29"/>
+      <w:headerReference w:type="default" r:id="rId30"/>
+      <w:footerReference w:type="even" r:id="rId31"/>
+      <w:footerReference w:type="default" r:id="rId32"/>
+      <w:headerReference w:type="first" r:id="rId33"/>
+      <w:footerReference w:type="first" r:id="rId34"/>
       <w:pgSz w:w="11906" w:h="16838"/>
       <w:pgMar w:top="1134" w:right="850" w:bottom="1134" w:left="1134" w:header="708" w:footer="708" w:gutter="0"/>
       <w:cols w:space="708"/>
@@ -1105,6 +3418,27 @@
     </w:lvl>
   </w:abstractNum>
   <w:abstractNum w:abstractNumId="2" w15:restartNumberingAfterBreak="0">
+    <w:nsid w:val="FFFFFF89"/>
+    <w:multiLevelType w:val="singleLevel"/>
+    <w:tmpl w:val="CC6AA288"/>
+    <w:lvl w:ilvl="0">
+      <w:start w:val="1"/>
+      <w:numFmt w:val="bullet"/>
+      <w:pStyle w:val="ListBullet"/>
+      <w:lvlText w:val=""/>
+      <w:lvlJc w:val="left"/>
+      <w:pPr>
+        <w:tabs>
+          <w:tab w:val="num" w:pos="360"/>
+        </w:tabs>
+        <w:ind w:left="360" w:hanging="360"/>
+      </w:pPr>
+      <w:rPr>
+        <w:rFonts w:ascii="Symbol" w:hAnsi="Symbol" w:hint="default"/>
+      </w:rPr>
+    </w:lvl>
+  </w:abstractNum>
+  <w:abstractNum w:abstractNumId="3" w15:restartNumberingAfterBreak="0">
     <w:nsid w:val="00000002"/>
     <w:multiLevelType w:val="multilevel"/>
     <w:tmpl w:val="00000002"/>
@@ -1227,7 +3561,7 @@
       </w:pPr>
     </w:lvl>
   </w:abstractNum>
-  <w:abstractNum w:abstractNumId="3" w15:restartNumberingAfterBreak="0">
+  <w:abstractNum w:abstractNumId="4" w15:restartNumberingAfterBreak="0">
     <w:nsid w:val="0000000F"/>
     <w:multiLevelType w:val="multilevel"/>
     <w:tmpl w:val="DEB8CC4C"/>
@@ -1430,7 +3764,7 @@
       </w:rPr>
     </w:lvl>
   </w:abstractNum>
-  <w:abstractNum w:abstractNumId="4" w15:restartNumberingAfterBreak="0">
+  <w:abstractNum w:abstractNumId="5" w15:restartNumberingAfterBreak="0">
     <w:nsid w:val="00000011"/>
     <w:multiLevelType w:val="multilevel"/>
     <w:tmpl w:val="DC4027D4"/>
@@ -1633,7 +3967,7 @@
       </w:rPr>
     </w:lvl>
   </w:abstractNum>
-  <w:abstractNum w:abstractNumId="5" w15:restartNumberingAfterBreak="0">
+  <w:abstractNum w:abstractNumId="6" w15:restartNumberingAfterBreak="0">
     <w:nsid w:val="04903F0F"/>
     <w:multiLevelType w:val="hybridMultilevel"/>
     <w:tmpl w:val="3270439A"/>
@@ -1720,7 +4054,7 @@
       </w:pPr>
     </w:lvl>
   </w:abstractNum>
-  <w:abstractNum w:abstractNumId="6" w15:restartNumberingAfterBreak="0">
+  <w:abstractNum w:abstractNumId="7" w15:restartNumberingAfterBreak="0">
     <w:nsid w:val="08B068A2"/>
     <w:multiLevelType w:val="multilevel"/>
     <w:tmpl w:val="2AFEC94E"/>
@@ -1842,13 +4176,13 @@
       </w:rPr>
     </w:lvl>
   </w:abstractNum>
-  <w:abstractNum w:abstractNumId="7" w15:restartNumberingAfterBreak="0">
+  <w:abstractNum w:abstractNumId="8" w15:restartNumberingAfterBreak="0">
     <w:nsid w:val="09CC1AE9"/>
     <w:multiLevelType w:val="multilevel"/>
     <w:tmpl w:val="6F544936"/>
     <w:numStyleLink w:val="20"/>
   </w:abstractNum>
-  <w:abstractNum w:abstractNumId="8" w15:restartNumberingAfterBreak="0">
+  <w:abstractNum w:abstractNumId="9" w15:restartNumberingAfterBreak="0">
     <w:nsid w:val="0AD25075"/>
     <w:multiLevelType w:val="hybridMultilevel"/>
     <w:tmpl w:val="AF02768E"/>
@@ -1938,7 +4272,7 @@
       </w:pPr>
     </w:lvl>
   </w:abstractNum>
-  <w:abstractNum w:abstractNumId="9" w15:restartNumberingAfterBreak="0">
+  <w:abstractNum w:abstractNumId="10" w15:restartNumberingAfterBreak="0">
     <w:nsid w:val="189C4FA4"/>
     <w:multiLevelType w:val="multilevel"/>
     <w:tmpl w:val="FBA81124"/>
@@ -2051,7 +4385,7 @@
       </w:pPr>
     </w:lvl>
   </w:abstractNum>
-  <w:abstractNum w:abstractNumId="10" w15:restartNumberingAfterBreak="0">
+  <w:abstractNum w:abstractNumId="11" w15:restartNumberingAfterBreak="0">
     <w:nsid w:val="1CE24A53"/>
     <w:multiLevelType w:val="hybridMultilevel"/>
     <w:tmpl w:val="34B8D798"/>
@@ -2141,7 +4475,7 @@
       </w:pPr>
     </w:lvl>
   </w:abstractNum>
-  <w:abstractNum w:abstractNumId="11" w15:restartNumberingAfterBreak="0">
+  <w:abstractNum w:abstractNumId="12" w15:restartNumberingAfterBreak="0">
     <w:nsid w:val="1E1D7E0E"/>
     <w:multiLevelType w:val="hybridMultilevel"/>
     <w:tmpl w:val="467EA4C6"/>
@@ -2230,13 +4564,13 @@
       </w:pPr>
     </w:lvl>
   </w:abstractNum>
-  <w:abstractNum w:abstractNumId="12" w15:restartNumberingAfterBreak="0">
+  <w:abstractNum w:abstractNumId="13" w15:restartNumberingAfterBreak="0">
     <w:nsid w:val="20906314"/>
     <w:multiLevelType w:val="multilevel"/>
     <w:tmpl w:val="6F544936"/>
     <w:numStyleLink w:val="20"/>
   </w:abstractNum>
-  <w:abstractNum w:abstractNumId="13" w15:restartNumberingAfterBreak="0">
+  <w:abstractNum w:abstractNumId="14" w15:restartNumberingAfterBreak="0">
     <w:nsid w:val="23A653BB"/>
     <w:multiLevelType w:val="hybridMultilevel"/>
     <w:tmpl w:val="58C4C8F6"/>
@@ -2350,7 +4684,7 @@
       </w:rPr>
     </w:lvl>
   </w:abstractNum>
-  <w:abstractNum w:abstractNumId="14" w15:restartNumberingAfterBreak="0">
+  <w:abstractNum w:abstractNumId="15" w15:restartNumberingAfterBreak="0">
     <w:nsid w:val="250E3643"/>
     <w:multiLevelType w:val="multilevel"/>
     <w:tmpl w:val="A3241794"/>
@@ -2498,7 +4832,7 @@
       </w:rPr>
     </w:lvl>
   </w:abstractNum>
-  <w:abstractNum w:abstractNumId="15" w15:restartNumberingAfterBreak="0">
+  <w:abstractNum w:abstractNumId="16" w15:restartNumberingAfterBreak="0">
     <w:nsid w:val="2D9B5041"/>
     <w:multiLevelType w:val="hybridMultilevel"/>
     <w:tmpl w:val="1492828E"/>
@@ -2588,7 +4922,7 @@
       </w:pPr>
     </w:lvl>
   </w:abstractNum>
-  <w:abstractNum w:abstractNumId="16" w15:restartNumberingAfterBreak="0">
+  <w:abstractNum w:abstractNumId="17" w15:restartNumberingAfterBreak="0">
     <w:nsid w:val="333F28D3"/>
     <w:multiLevelType w:val="multilevel"/>
     <w:tmpl w:val="761CABA8"/>
@@ -2716,13 +5050,13 @@
       </w:rPr>
     </w:lvl>
   </w:abstractNum>
-  <w:abstractNum w:abstractNumId="17" w15:restartNumberingAfterBreak="0">
+  <w:abstractNum w:abstractNumId="18" w15:restartNumberingAfterBreak="0">
     <w:nsid w:val="35500D25"/>
     <w:multiLevelType w:val="multilevel"/>
     <w:tmpl w:val="6F544936"/>
     <w:numStyleLink w:val="20"/>
   </w:abstractNum>
-  <w:abstractNum w:abstractNumId="18" w15:restartNumberingAfterBreak="0">
+  <w:abstractNum w:abstractNumId="19" w15:restartNumberingAfterBreak="0">
     <w:nsid w:val="393E4326"/>
     <w:multiLevelType w:val="hybridMultilevel"/>
     <w:tmpl w:val="467EA4C6"/>
@@ -2811,7 +5145,7 @@
       </w:pPr>
     </w:lvl>
   </w:abstractNum>
-  <w:abstractNum w:abstractNumId="19" w15:restartNumberingAfterBreak="0">
+  <w:abstractNum w:abstractNumId="20" w15:restartNumberingAfterBreak="0">
     <w:nsid w:val="58A57FB1"/>
     <w:multiLevelType w:val="multilevel"/>
     <w:tmpl w:val="6F544936"/>
@@ -2952,7 +5286,7 @@
       </w:rPr>
     </w:lvl>
   </w:abstractNum>
-  <w:abstractNum w:abstractNumId="20" w15:restartNumberingAfterBreak="0">
+  <w:abstractNum w:abstractNumId="21" w15:restartNumberingAfterBreak="0">
     <w:nsid w:val="5D123824"/>
     <w:multiLevelType w:val="hybridMultilevel"/>
     <w:tmpl w:val="D9EAA19A"/>
@@ -3039,7 +5373,7 @@
       </w:pPr>
     </w:lvl>
   </w:abstractNum>
-  <w:abstractNum w:abstractNumId="21" w15:restartNumberingAfterBreak="0">
+  <w:abstractNum w:abstractNumId="22" w15:restartNumberingAfterBreak="0">
     <w:nsid w:val="64CA5EDA"/>
     <w:multiLevelType w:val="hybridMultilevel"/>
     <w:tmpl w:val="14AA015E"/>
@@ -3152,7 +5486,7 @@
       </w:rPr>
     </w:lvl>
   </w:abstractNum>
-  <w:abstractNum w:abstractNumId="22" w15:restartNumberingAfterBreak="0">
+  <w:abstractNum w:abstractNumId="23" w15:restartNumberingAfterBreak="0">
     <w:nsid w:val="67FC70B2"/>
     <w:multiLevelType w:val="hybridMultilevel"/>
     <w:tmpl w:val="6F4C2824"/>
@@ -3242,7 +5576,7 @@
       </w:pPr>
     </w:lvl>
   </w:abstractNum>
-  <w:abstractNum w:abstractNumId="23" w15:restartNumberingAfterBreak="0">
+  <w:abstractNum w:abstractNumId="24" w15:restartNumberingAfterBreak="0">
     <w:nsid w:val="69B51D24"/>
     <w:multiLevelType w:val="multilevel"/>
     <w:tmpl w:val="6F544936"/>
@@ -3384,7 +5718,7 @@
       </w:rPr>
     </w:lvl>
   </w:abstractNum>
-  <w:abstractNum w:abstractNumId="24" w15:restartNumberingAfterBreak="0">
+  <w:abstractNum w:abstractNumId="25" w15:restartNumberingAfterBreak="0">
     <w:nsid w:val="6FE325F8"/>
     <w:multiLevelType w:val="multilevel"/>
     <w:tmpl w:val="98C8DEDE"/>
@@ -3524,7 +5858,7 @@
       </w:rPr>
     </w:lvl>
   </w:abstractNum>
-  <w:abstractNum w:abstractNumId="25" w15:restartNumberingAfterBreak="0">
+  <w:abstractNum w:abstractNumId="26" w15:restartNumberingAfterBreak="0">
     <w:nsid w:val="721A177E"/>
     <w:multiLevelType w:val="hybridMultilevel"/>
     <w:tmpl w:val="9E3AB358"/>
@@ -3666,82 +6000,85 @@
     </w:lvl>
   </w:abstractNum>
   <w:num w:numId="1" w16cid:durableId="1592857832">
-    <w:abstractNumId w:val="16"/>
+    <w:abstractNumId w:val="17"/>
   </w:num>
   <w:num w:numId="2" w16cid:durableId="479155617">
-    <w:abstractNumId w:val="24"/>
+    <w:abstractNumId w:val="25"/>
   </w:num>
   <w:num w:numId="3" w16cid:durableId="461924969">
-    <w:abstractNumId w:val="14"/>
+    <w:abstractNumId w:val="15"/>
   </w:num>
   <w:num w:numId="4" w16cid:durableId="1741295260">
     <w:abstractNumId w:val="1"/>
   </w:num>
   <w:num w:numId="5" w16cid:durableId="15547660">
-    <w:abstractNumId w:val="25"/>
+    <w:abstractNumId w:val="26"/>
   </w:num>
   <w:num w:numId="6" w16cid:durableId="1450658848">
-    <w:abstractNumId w:val="19"/>
+    <w:abstractNumId w:val="20"/>
   </w:num>
   <w:num w:numId="7" w16cid:durableId="1220170990">
+    <w:abstractNumId w:val="7"/>
+  </w:num>
+  <w:num w:numId="8" w16cid:durableId="888609964">
+    <w:abstractNumId w:val="14"/>
+  </w:num>
+  <w:num w:numId="9" w16cid:durableId="1135945964">
+    <w:abstractNumId w:val="11"/>
+  </w:num>
+  <w:num w:numId="10" w16cid:durableId="672222422">
+    <w:abstractNumId w:val="21"/>
+  </w:num>
+  <w:num w:numId="11" w16cid:durableId="1137797277">
     <w:abstractNumId w:val="6"/>
   </w:num>
-  <w:num w:numId="8" w16cid:durableId="888609964">
-    <w:abstractNumId w:val="13"/>
-  </w:num>
-  <w:num w:numId="9" w16cid:durableId="1135945964">
-    <w:abstractNumId w:val="10"/>
-  </w:num>
-  <w:num w:numId="10" w16cid:durableId="672222422">
-    <w:abstractNumId w:val="20"/>
-  </w:num>
-  <w:num w:numId="11" w16cid:durableId="1137797277">
-    <w:abstractNumId w:val="5"/>
-  </w:num>
   <w:num w:numId="12" w16cid:durableId="2037266142">
-    <w:abstractNumId w:val="22"/>
+    <w:abstractNumId w:val="23"/>
   </w:num>
   <w:num w:numId="13" w16cid:durableId="1661958550">
     <w:abstractNumId w:val="0"/>
   </w:num>
   <w:num w:numId="14" w16cid:durableId="1119682863">
-    <w:abstractNumId w:val="23"/>
+    <w:abstractNumId w:val="24"/>
   </w:num>
   <w:num w:numId="15" w16cid:durableId="752552906">
-    <w:abstractNumId w:val="7"/>
+    <w:abstractNumId w:val="8"/>
   </w:num>
   <w:num w:numId="16" w16cid:durableId="1941059747">
-    <w:abstractNumId w:val="17"/>
+    <w:abstractNumId w:val="18"/>
   </w:num>
   <w:num w:numId="17" w16cid:durableId="987900779">
+    <w:abstractNumId w:val="13"/>
+  </w:num>
+  <w:num w:numId="18" w16cid:durableId="369308094">
+    <w:abstractNumId w:val="10"/>
+  </w:num>
+  <w:num w:numId="19" w16cid:durableId="625703077">
+    <w:abstractNumId w:val="22"/>
+  </w:num>
+  <w:num w:numId="20" w16cid:durableId="351418717">
+    <w:abstractNumId w:val="4"/>
+  </w:num>
+  <w:num w:numId="21" w16cid:durableId="961494429">
+    <w:abstractNumId w:val="5"/>
+  </w:num>
+  <w:num w:numId="22" w16cid:durableId="1985617754">
+    <w:abstractNumId w:val="19"/>
+  </w:num>
+  <w:num w:numId="23" w16cid:durableId="1492140974">
     <w:abstractNumId w:val="12"/>
   </w:num>
-  <w:num w:numId="18" w16cid:durableId="369308094">
+  <w:num w:numId="24" w16cid:durableId="580144100">
+    <w:abstractNumId w:val="3"/>
+  </w:num>
+  <w:num w:numId="25" w16cid:durableId="1100830909">
     <w:abstractNumId w:val="9"/>
   </w:num>
-  <w:num w:numId="19" w16cid:durableId="625703077">
-    <w:abstractNumId w:val="21"/>
+  <w:num w:numId="26" w16cid:durableId="1095394114">
+    <w:abstractNumId w:val="16"/>
   </w:num>
-  <w:num w:numId="20" w16cid:durableId="351418717">
-    <w:abstractNumId w:val="3"/>
-  </w:num>
-  <w:num w:numId="21" w16cid:durableId="961494429">
-    <w:abstractNumId w:val="4"/>
-  </w:num>
-  <w:num w:numId="22" w16cid:durableId="1985617754">
-    <w:abstractNumId w:val="18"/>
-  </w:num>
-  <w:num w:numId="23" w16cid:durableId="1492140974">
-    <w:abstractNumId w:val="11"/>
-  </w:num>
-  <w:num w:numId="24" w16cid:durableId="580144100">
+  <w:num w:numId="27" w16cid:durableId="2076119133">
     <w:abstractNumId w:val="2"/>
-  </w:num>
-  <w:num w:numId="25" w16cid:durableId="1100830909">
-    <w:abstractNumId w:val="8"/>
-  </w:num>
-  <w:num w:numId="26" w16cid:durableId="1095394114">
-    <w:abstractNumId w:val="15"/>
   </w:num>
   <w:numIdMacAtCleanup w:val="12"/>
 </w:numbering>
@@ -4389,7 +6726,6 @@
   <w:style w:type="character" w:default="1" w:styleId="DefaultParagraphFont">
     <w:name w:val="Default Paragraph Font"/>
     <w:uiPriority w:val="1"/>
-    <w:semiHidden/>
     <w:unhideWhenUsed/>
   </w:style>
   <w:style w:type="table" w:default="1" w:styleId="TableNormal">
@@ -5383,6 +7719,20 @@
       <w:lang w:val="en-US" w:eastAsia="en-US"/>
     </w:rPr>
   </w:style>
+  <w:style w:type="paragraph" w:styleId="ListBullet">
+    <w:name w:val="List Bullet"/>
+    <w:basedOn w:val="Normal"/>
+    <w:uiPriority w:val="99"/>
+    <w:unhideWhenUsed/>
+    <w:locked/>
+    <w:rsid w:val="00AC22FB"/>
+    <w:pPr>
+      <w:numPr>
+        <w:numId w:val="27"/>
+      </w:numPr>
+      <w:contextualSpacing/>
+    </w:pPr>
+  </w:style>
 </w:styles>
 </file>
 

</xml_diff>